<commit_message>
standup 1 submission uploaded
</commit_message>
<xml_diff>
--- a/Assignment 3A: Project Standups/Assignment 3A - Project standup 1.docx
+++ b/Assignment 3A: Project Standups/Assignment 3A - Project standup 1.docx
@@ -151,6 +151,18 @@
       <w:pPr>
         <w:jc w:val="center"/>
         <w:rPr>
+          <w:b/>
+          <w:bCs/>
+          <w:color w:val="000000" w:themeColor="text1"/>
+          <w:sz w:val="32"/>
+          <w:szCs w:val="32"/>
+        </w:rPr>
+      </w:pPr>
+    </w:p>
+    <w:p>
+      <w:pPr>
+        <w:jc w:val="center"/>
+        <w:rPr>
           <w:color w:val="000000" w:themeColor="text1"/>
           <w:sz w:val="40"/>
           <w:szCs w:val="40"/>
@@ -207,14 +219,6 @@
     </w:p>
     <w:p>
       <w:pPr>
-        <w:jc w:val="center"/>
-        <w:rPr>
-          <w:color w:val="000000" w:themeColor="text1"/>
-          <w:sz w:val="28"/>
-          <w:szCs w:val="28"/>
-        </w:rPr>
-      </w:pPr>
-      <w:r>
         <w:rPr>
           <w:b/>
           <w:bCs/>
@@ -222,46 +226,25 @@
           <w:sz w:val="28"/>
           <w:szCs w:val="28"/>
         </w:rPr>
-        <w:t>Project Topic:</w:t>
-      </w:r>
-      <w:r>
+      </w:pPr>
+    </w:p>
+    <w:p>
+      <w:pPr>
         <w:rPr>
           <w:color w:val="000000" w:themeColor="text1"/>
           <w:sz w:val="28"/>
           <w:szCs w:val="28"/>
         </w:rPr>
-        <w:t xml:space="preserve"> OECD Health Statistics</w:t>
-      </w:r>
+      </w:pPr>
     </w:p>
     <w:p>
       <w:pPr>
-        <w:jc w:val="center"/>
         <w:rPr>
           <w:color w:val="000000" w:themeColor="text1"/>
           <w:sz w:val="28"/>
           <w:szCs w:val="28"/>
         </w:rPr>
       </w:pPr>
-    </w:p>
-    <w:p>
-      <w:pPr>
-        <w:jc w:val="center"/>
-        <w:rPr>
-          <w:b/>
-          <w:bCs/>
-          <w:sz w:val="28"/>
-          <w:szCs w:val="28"/>
-        </w:rPr>
-      </w:pPr>
-      <w:r>
-        <w:rPr>
-          <w:b/>
-          <w:bCs/>
-          <w:sz w:val="28"/>
-          <w:szCs w:val="28"/>
-        </w:rPr>
-        <w:t>Healthcare Spending and Life Expectancy Across OECD Countries</w:t>
-      </w:r>
     </w:p>
     <w:p>
       <w:pPr>
@@ -499,13 +482,45 @@
           <w:color w:val="000000" w:themeColor="text1"/>
         </w:rPr>
       </w:pPr>
+      <w:hyperlink r:id="rId9" w:history="1">
+        <w:r>
+          <w:rPr>
+            <w:rStyle w:val="Hyperlink"/>
+            <w:b/>
+            <w:bCs/>
+          </w:rPr>
+          <w:t xml:space="preserve">Submission Folder </w:t>
+        </w:r>
+        <w:r>
+          <w:rPr>
+            <w:rStyle w:val="Hyperlink"/>
+            <w:b/>
+            <w:bCs/>
+          </w:rPr>
+          <w:t>GitHub Link</w:t>
+        </w:r>
+      </w:hyperlink>
+      <w:r>
+        <w:rPr>
+          <w:color w:val="000000" w:themeColor="text1"/>
+        </w:rPr>
+        <w:t xml:space="preserve"> </w:t>
+      </w:r>
+    </w:p>
+    <w:p>
+      <w:pPr>
+        <w:jc w:val="center"/>
+        <w:rPr>
+          <w:color w:val="000000" w:themeColor="text1"/>
+        </w:rPr>
+      </w:pPr>
       <w:r>
         <w:rPr>
           <w:b/>
           <w:bCs/>
           <w:color w:val="000000" w:themeColor="text1"/>
         </w:rPr>
-        <w:t>GitHub Link:</w:t>
+        <w:t>Word Count:</w:t>
       </w:r>
       <w:r>
         <w:rPr>
@@ -513,35 +528,11 @@
         </w:rPr>
         <w:t xml:space="preserve"> </w:t>
       </w:r>
-      <w:hyperlink r:id="rId9" w:history="1">
-        <w:r>
-          <w:rPr>
-            <w:rStyle w:val="Hyperlink"/>
-          </w:rPr>
-          <w:t>SyedMahdi15/COS30045-Data-Visualisation-Project</w:t>
-        </w:r>
-      </w:hyperlink>
-    </w:p>
-    <w:p>
-      <w:pPr>
-        <w:jc w:val="center"/>
-        <w:rPr>
-          <w:color w:val="000000" w:themeColor="text1"/>
-        </w:rPr>
-      </w:pPr>
-      <w:r>
-        <w:rPr>
-          <w:b/>
-          <w:bCs/>
-          <w:color w:val="000000" w:themeColor="text1"/>
-        </w:rPr>
-        <w:t>Total Word Count:</w:t>
-      </w:r>
       <w:r>
         <w:rPr>
           <w:color w:val="000000" w:themeColor="text1"/>
         </w:rPr>
-        <w:t xml:space="preserve"> [To be added]</w:t>
+        <w:t>630</w:t>
       </w:r>
     </w:p>
     <w:p>
@@ -642,7 +633,8 @@
       <w:pPr>
         <w:pStyle w:val="TOC1"/>
         <w:tabs>
-          <w:tab w:val="right" w:leader="dot" w:pos="9736"/>
+          <w:tab w:val="left" w:pos="720"/>
+          <w:tab w:val="right" w:leader="dot" w:pos="10456"/>
         </w:tabs>
         <w:rPr>
           <w:rFonts w:eastAsiaTheme="minorEastAsia" w:cstheme="minorBidi"/>
@@ -680,13 +672,34 @@
         </w:rPr>
         <w:fldChar w:fldCharType="separate"/>
       </w:r>
-      <w:hyperlink w:anchor="_Toc239535813" w:history="1">
+      <w:hyperlink w:anchor="_Toc239546166" w:history="1">
         <w:r>
           <w:rPr>
             <w:rStyle w:val="Hyperlink"/>
             <w:noProof/>
           </w:rPr>
-          <w:t>1.0 - &lt;HEADING&gt;</w:t>
+          <w:t>1.0</w:t>
+        </w:r>
+        <w:r>
+          <w:rPr>
+            <w:rFonts w:eastAsiaTheme="minorEastAsia" w:cstheme="minorBidi"/>
+            <w:b w:val="0"/>
+            <w:bCs w:val="0"/>
+            <w:caps w:val="0"/>
+            <w:noProof/>
+            <w:kern w:val="2"/>
+            <w:sz w:val="24"/>
+            <w:szCs w:val="24"/>
+            <w14:ligatures w14:val="standardContextual"/>
+          </w:rPr>
+          <w:tab/>
+        </w:r>
+        <w:r>
+          <w:rPr>
+            <w:rStyle w:val="Hyperlink"/>
+            <w:noProof/>
+          </w:rPr>
+          <w:t>Team Schedule</w:t>
         </w:r>
         <w:r>
           <w:rPr>
@@ -707,7 +720,7 @@
             <w:noProof/>
             <w:webHidden/>
           </w:rPr>
-          <w:instrText xml:space="preserve"> PAGEREF _Toc239535813 \h </w:instrText>
+          <w:instrText xml:space="preserve"> PAGEREF _Toc239546166 \h </w:instrText>
         </w:r>
         <w:r>
           <w:rPr>
@@ -739,6 +752,472 @@
       </w:hyperlink>
     </w:p>
     <w:p>
+      <w:pPr>
+        <w:pStyle w:val="TOC1"/>
+        <w:tabs>
+          <w:tab w:val="left" w:pos="720"/>
+          <w:tab w:val="right" w:leader="dot" w:pos="10456"/>
+        </w:tabs>
+        <w:rPr>
+          <w:rFonts w:eastAsiaTheme="minorEastAsia" w:cstheme="minorBidi"/>
+          <w:b w:val="0"/>
+          <w:bCs w:val="0"/>
+          <w:caps w:val="0"/>
+          <w:noProof/>
+          <w:kern w:val="2"/>
+          <w:sz w:val="24"/>
+          <w:szCs w:val="24"/>
+          <w14:ligatures w14:val="standardContextual"/>
+        </w:rPr>
+      </w:pPr>
+      <w:hyperlink w:anchor="_Toc239546167" w:history="1">
+        <w:r>
+          <w:rPr>
+            <w:rStyle w:val="Hyperlink"/>
+            <w:noProof/>
+          </w:rPr>
+          <w:t>2.0</w:t>
+        </w:r>
+        <w:r>
+          <w:rPr>
+            <w:rFonts w:eastAsiaTheme="minorEastAsia" w:cstheme="minorBidi"/>
+            <w:b w:val="0"/>
+            <w:bCs w:val="0"/>
+            <w:caps w:val="0"/>
+            <w:noProof/>
+            <w:kern w:val="2"/>
+            <w:sz w:val="24"/>
+            <w:szCs w:val="24"/>
+            <w14:ligatures w14:val="standardContextual"/>
+          </w:rPr>
+          <w:tab/>
+        </w:r>
+        <w:r>
+          <w:rPr>
+            <w:rStyle w:val="Hyperlink"/>
+            <w:noProof/>
+          </w:rPr>
+          <w:t>Team Task To-Do List</w:t>
+        </w:r>
+        <w:r>
+          <w:rPr>
+            <w:noProof/>
+            <w:webHidden/>
+          </w:rPr>
+          <w:tab/>
+        </w:r>
+        <w:r>
+          <w:rPr>
+            <w:noProof/>
+            <w:webHidden/>
+          </w:rPr>
+          <w:fldChar w:fldCharType="begin"/>
+        </w:r>
+        <w:r>
+          <w:rPr>
+            <w:noProof/>
+            <w:webHidden/>
+          </w:rPr>
+          <w:instrText xml:space="preserve"> PAGEREF _Toc239546167 \h </w:instrText>
+        </w:r>
+        <w:r>
+          <w:rPr>
+            <w:noProof/>
+            <w:webHidden/>
+          </w:rPr>
+        </w:r>
+        <w:r>
+          <w:rPr>
+            <w:noProof/>
+            <w:webHidden/>
+          </w:rPr>
+          <w:fldChar w:fldCharType="separate"/>
+        </w:r>
+        <w:r>
+          <w:rPr>
+            <w:noProof/>
+            <w:webHidden/>
+          </w:rPr>
+          <w:t>3</w:t>
+        </w:r>
+        <w:r>
+          <w:rPr>
+            <w:noProof/>
+            <w:webHidden/>
+          </w:rPr>
+          <w:fldChar w:fldCharType="end"/>
+        </w:r>
+      </w:hyperlink>
+    </w:p>
+    <w:p>
+      <w:pPr>
+        <w:pStyle w:val="TOC1"/>
+        <w:tabs>
+          <w:tab w:val="left" w:pos="720"/>
+          <w:tab w:val="right" w:leader="dot" w:pos="10456"/>
+        </w:tabs>
+        <w:rPr>
+          <w:rFonts w:eastAsiaTheme="minorEastAsia" w:cstheme="minorBidi"/>
+          <w:b w:val="0"/>
+          <w:bCs w:val="0"/>
+          <w:caps w:val="0"/>
+          <w:noProof/>
+          <w:kern w:val="2"/>
+          <w:sz w:val="24"/>
+          <w:szCs w:val="24"/>
+          <w14:ligatures w14:val="standardContextual"/>
+        </w:rPr>
+      </w:pPr>
+      <w:hyperlink w:anchor="_Toc239546168" w:history="1">
+        <w:r>
+          <w:rPr>
+            <w:rStyle w:val="Hyperlink"/>
+            <w:noProof/>
+          </w:rPr>
+          <w:t>3.0</w:t>
+        </w:r>
+        <w:r>
+          <w:rPr>
+            <w:rFonts w:eastAsiaTheme="minorEastAsia" w:cstheme="minorBidi"/>
+            <w:b w:val="0"/>
+            <w:bCs w:val="0"/>
+            <w:caps w:val="0"/>
+            <w:noProof/>
+            <w:kern w:val="2"/>
+            <w:sz w:val="24"/>
+            <w:szCs w:val="24"/>
+            <w14:ligatures w14:val="standardContextual"/>
+          </w:rPr>
+          <w:tab/>
+        </w:r>
+        <w:r>
+          <w:rPr>
+            <w:rStyle w:val="Hyperlink"/>
+            <w:noProof/>
+          </w:rPr>
+          <w:t>Team Tools</w:t>
+        </w:r>
+        <w:r>
+          <w:rPr>
+            <w:noProof/>
+            <w:webHidden/>
+          </w:rPr>
+          <w:tab/>
+        </w:r>
+        <w:r>
+          <w:rPr>
+            <w:noProof/>
+            <w:webHidden/>
+          </w:rPr>
+          <w:fldChar w:fldCharType="begin"/>
+        </w:r>
+        <w:r>
+          <w:rPr>
+            <w:noProof/>
+            <w:webHidden/>
+          </w:rPr>
+          <w:instrText xml:space="preserve"> PAGEREF _Toc239546168 \h </w:instrText>
+        </w:r>
+        <w:r>
+          <w:rPr>
+            <w:noProof/>
+            <w:webHidden/>
+          </w:rPr>
+        </w:r>
+        <w:r>
+          <w:rPr>
+            <w:noProof/>
+            <w:webHidden/>
+          </w:rPr>
+          <w:fldChar w:fldCharType="separate"/>
+        </w:r>
+        <w:r>
+          <w:rPr>
+            <w:noProof/>
+            <w:webHidden/>
+          </w:rPr>
+          <w:t>3</w:t>
+        </w:r>
+        <w:r>
+          <w:rPr>
+            <w:noProof/>
+            <w:webHidden/>
+          </w:rPr>
+          <w:fldChar w:fldCharType="end"/>
+        </w:r>
+      </w:hyperlink>
+    </w:p>
+    <w:p>
+      <w:pPr>
+        <w:pStyle w:val="TOC1"/>
+        <w:tabs>
+          <w:tab w:val="left" w:pos="720"/>
+          <w:tab w:val="right" w:leader="dot" w:pos="10456"/>
+        </w:tabs>
+        <w:rPr>
+          <w:rFonts w:eastAsiaTheme="minorEastAsia" w:cstheme="minorBidi"/>
+          <w:b w:val="0"/>
+          <w:bCs w:val="0"/>
+          <w:caps w:val="0"/>
+          <w:noProof/>
+          <w:kern w:val="2"/>
+          <w:sz w:val="24"/>
+          <w:szCs w:val="24"/>
+          <w14:ligatures w14:val="standardContextual"/>
+        </w:rPr>
+      </w:pPr>
+      <w:hyperlink w:anchor="_Toc239546169" w:history="1">
+        <w:r>
+          <w:rPr>
+            <w:rStyle w:val="Hyperlink"/>
+            <w:noProof/>
+          </w:rPr>
+          <w:t>4.0</w:t>
+        </w:r>
+        <w:r>
+          <w:rPr>
+            <w:rFonts w:eastAsiaTheme="minorEastAsia" w:cstheme="minorBidi"/>
+            <w:b w:val="0"/>
+            <w:bCs w:val="0"/>
+            <w:caps w:val="0"/>
+            <w:noProof/>
+            <w:kern w:val="2"/>
+            <w:sz w:val="24"/>
+            <w:szCs w:val="24"/>
+            <w14:ligatures w14:val="standardContextual"/>
+          </w:rPr>
+          <w:tab/>
+        </w:r>
+        <w:r>
+          <w:rPr>
+            <w:rStyle w:val="Hyperlink"/>
+            <w:noProof/>
+          </w:rPr>
+          <w:t>Project Schedule</w:t>
+        </w:r>
+        <w:r>
+          <w:rPr>
+            <w:noProof/>
+            <w:webHidden/>
+          </w:rPr>
+          <w:tab/>
+        </w:r>
+        <w:r>
+          <w:rPr>
+            <w:noProof/>
+            <w:webHidden/>
+          </w:rPr>
+          <w:fldChar w:fldCharType="begin"/>
+        </w:r>
+        <w:r>
+          <w:rPr>
+            <w:noProof/>
+            <w:webHidden/>
+          </w:rPr>
+          <w:instrText xml:space="preserve"> PAGEREF _Toc239546169 \h </w:instrText>
+        </w:r>
+        <w:r>
+          <w:rPr>
+            <w:noProof/>
+            <w:webHidden/>
+          </w:rPr>
+        </w:r>
+        <w:r>
+          <w:rPr>
+            <w:noProof/>
+            <w:webHidden/>
+          </w:rPr>
+          <w:fldChar w:fldCharType="separate"/>
+        </w:r>
+        <w:r>
+          <w:rPr>
+            <w:noProof/>
+            <w:webHidden/>
+          </w:rPr>
+          <w:t>5</w:t>
+        </w:r>
+        <w:r>
+          <w:rPr>
+            <w:noProof/>
+            <w:webHidden/>
+          </w:rPr>
+          <w:fldChar w:fldCharType="end"/>
+        </w:r>
+      </w:hyperlink>
+    </w:p>
+    <w:p>
+      <w:pPr>
+        <w:pStyle w:val="TOC1"/>
+        <w:tabs>
+          <w:tab w:val="left" w:pos="720"/>
+          <w:tab w:val="right" w:leader="dot" w:pos="10456"/>
+        </w:tabs>
+        <w:rPr>
+          <w:rFonts w:eastAsiaTheme="minorEastAsia" w:cstheme="minorBidi"/>
+          <w:b w:val="0"/>
+          <w:bCs w:val="0"/>
+          <w:caps w:val="0"/>
+          <w:noProof/>
+          <w:kern w:val="2"/>
+          <w:sz w:val="24"/>
+          <w:szCs w:val="24"/>
+          <w14:ligatures w14:val="standardContextual"/>
+        </w:rPr>
+      </w:pPr>
+      <w:hyperlink w:anchor="_Toc239546170" w:history="1">
+        <w:r>
+          <w:rPr>
+            <w:rStyle w:val="Hyperlink"/>
+            <w:noProof/>
+          </w:rPr>
+          <w:t>5.0</w:t>
+        </w:r>
+        <w:r>
+          <w:rPr>
+            <w:rFonts w:eastAsiaTheme="minorEastAsia" w:cstheme="minorBidi"/>
+            <w:b w:val="0"/>
+            <w:bCs w:val="0"/>
+            <w:caps w:val="0"/>
+            <w:noProof/>
+            <w:kern w:val="2"/>
+            <w:sz w:val="24"/>
+            <w:szCs w:val="24"/>
+            <w14:ligatures w14:val="standardContextual"/>
+          </w:rPr>
+          <w:tab/>
+        </w:r>
+        <w:r>
+          <w:rPr>
+            <w:rStyle w:val="Hyperlink"/>
+            <w:noProof/>
+          </w:rPr>
+          <w:t>Teamwork Issues</w:t>
+        </w:r>
+        <w:r>
+          <w:rPr>
+            <w:noProof/>
+            <w:webHidden/>
+          </w:rPr>
+          <w:tab/>
+        </w:r>
+        <w:r>
+          <w:rPr>
+            <w:noProof/>
+            <w:webHidden/>
+          </w:rPr>
+          <w:fldChar w:fldCharType="begin"/>
+        </w:r>
+        <w:r>
+          <w:rPr>
+            <w:noProof/>
+            <w:webHidden/>
+          </w:rPr>
+          <w:instrText xml:space="preserve"> PAGEREF _Toc239546170 \h </w:instrText>
+        </w:r>
+        <w:r>
+          <w:rPr>
+            <w:noProof/>
+            <w:webHidden/>
+          </w:rPr>
+        </w:r>
+        <w:r>
+          <w:rPr>
+            <w:noProof/>
+            <w:webHidden/>
+          </w:rPr>
+          <w:fldChar w:fldCharType="separate"/>
+        </w:r>
+        <w:r>
+          <w:rPr>
+            <w:noProof/>
+            <w:webHidden/>
+          </w:rPr>
+          <w:t>7</w:t>
+        </w:r>
+        <w:r>
+          <w:rPr>
+            <w:noProof/>
+            <w:webHidden/>
+          </w:rPr>
+          <w:fldChar w:fldCharType="end"/>
+        </w:r>
+      </w:hyperlink>
+    </w:p>
+    <w:p>
+      <w:pPr>
+        <w:pStyle w:val="TOC2"/>
+        <w:tabs>
+          <w:tab w:val="right" w:leader="dot" w:pos="10456"/>
+        </w:tabs>
+        <w:rPr>
+          <w:rFonts w:eastAsiaTheme="minorEastAsia" w:cstheme="minorBidi"/>
+          <w:smallCaps w:val="0"/>
+          <w:noProof/>
+          <w:kern w:val="2"/>
+          <w:sz w:val="24"/>
+          <w:szCs w:val="24"/>
+          <w14:ligatures w14:val="standardContextual"/>
+        </w:rPr>
+      </w:pPr>
+      <w:hyperlink w:anchor="_Toc239546171" w:history="1">
+        <w:r>
+          <w:rPr>
+            <w:rStyle w:val="Hyperlink"/>
+            <w:noProof/>
+          </w:rPr>
+          <w:t>Overall risk mitigation strategy:</w:t>
+        </w:r>
+        <w:r>
+          <w:rPr>
+            <w:noProof/>
+            <w:webHidden/>
+          </w:rPr>
+          <w:tab/>
+        </w:r>
+        <w:r>
+          <w:rPr>
+            <w:noProof/>
+            <w:webHidden/>
+          </w:rPr>
+          <w:fldChar w:fldCharType="begin"/>
+        </w:r>
+        <w:r>
+          <w:rPr>
+            <w:noProof/>
+            <w:webHidden/>
+          </w:rPr>
+          <w:instrText xml:space="preserve"> PAGEREF _Toc239546171 \h </w:instrText>
+        </w:r>
+        <w:r>
+          <w:rPr>
+            <w:noProof/>
+            <w:webHidden/>
+          </w:rPr>
+        </w:r>
+        <w:r>
+          <w:rPr>
+            <w:noProof/>
+            <w:webHidden/>
+          </w:rPr>
+          <w:fldChar w:fldCharType="separate"/>
+        </w:r>
+        <w:r>
+          <w:rPr>
+            <w:noProof/>
+            <w:webHidden/>
+          </w:rPr>
+          <w:t>7</w:t>
+        </w:r>
+        <w:r>
+          <w:rPr>
+            <w:noProof/>
+            <w:webHidden/>
+          </w:rPr>
+          <w:fldChar w:fldCharType="end"/>
+        </w:r>
+      </w:hyperlink>
+    </w:p>
+    <w:p>
       <w:r>
         <w:rPr>
           <w:b/>
@@ -774,28 +1253,2175 @@
         <w:pStyle w:val="Heading1"/>
         <w:jc w:val="center"/>
       </w:pPr>
-      <w:bookmarkStart w:id="0" w:name="_Toc234700225"/>
-      <w:bookmarkStart w:id="1" w:name="_Toc239535813"/>
+      <w:bookmarkStart w:id="0" w:name="_Toc239546166"/>
       <w:r>
         <w:lastRenderedPageBreak/>
-        <w:t xml:space="preserve">1.0 </w:t>
+        <w:t>Team S</w:t>
       </w:r>
       <w:r>
-        <w:t xml:space="preserve">- </w:t>
+        <w:t>chedule</w:t>
+      </w:r>
+      <w:bookmarkEnd w:id="0"/>
+    </w:p>
+    <w:p>
+      <w:r>
+        <w:t>The team</w:t>
       </w:r>
       <w:r>
-        <w:t>&lt;HEADING&gt;</w:t>
+        <w:t xml:space="preserve"> has </w:t>
       </w:r>
-      <w:bookmarkEnd w:id="0"/>
+      <w:r>
+        <w:t xml:space="preserve">a conflict in personal schedules therefore regular meetings were unable to be scheduled. </w:t>
+      </w:r>
+      <w:r>
+        <w:t xml:space="preserve">Syed is available </w:t>
+      </w:r>
+      <w:r>
+        <w:t xml:space="preserve">before 2.30pm AEST however Dilhani is only available </w:t>
+      </w:r>
+      <w:r>
+        <w:t>after business hours</w:t>
+      </w:r>
+      <w:r>
+        <w:t xml:space="preserve"> on weekdays. </w:t>
+      </w:r>
+      <w:r>
+        <w:t>The first standup</w:t>
+      </w:r>
+      <w:r>
+        <w:t xml:space="preserve"> was held </w:t>
+      </w:r>
+      <w:r>
+        <w:t>midday on</w:t>
+      </w:r>
+      <w:r>
+        <w:t xml:space="preserve"> </w:t>
+      </w:r>
+      <w:r>
+        <w:t>25/08/26</w:t>
+      </w:r>
+      <w:r>
+        <w:t xml:space="preserve">. </w:t>
+      </w:r>
+    </w:p>
+    <w:p/>
+    <w:p>
+      <w:pPr>
+        <w:pStyle w:val="Heading1"/>
+        <w:jc w:val="center"/>
+      </w:pPr>
+      <w:bookmarkStart w:id="1" w:name="_Toc239546167"/>
+      <w:r>
+        <w:t xml:space="preserve">Team </w:t>
+      </w:r>
+      <w:r>
+        <w:t>Task To-Do List</w:t>
+      </w:r>
       <w:bookmarkEnd w:id="1"/>
     </w:p>
+    <w:p>
+      <w:r>
+        <w:t>List of tasks to</w:t>
+      </w:r>
+      <w:r>
+        <w:t xml:space="preserve"> complete before next standup:</w:t>
+      </w:r>
+    </w:p>
+    <w:p>
+      <w:pPr>
+        <w:pStyle w:val="Heading5"/>
+        <w:rPr>
+          <w:b w:val="0"/>
+          <w:bCs w:val="0"/>
+        </w:rPr>
+      </w:pPr>
+      <w:r>
+        <w:rPr>
+          <w:b w:val="0"/>
+          <w:bCs w:val="0"/>
+        </w:rPr>
+        <w:t xml:space="preserve">Complete and submit </w:t>
+      </w:r>
+      <w:r>
+        <w:rPr>
+          <w:b w:val="0"/>
+          <w:bCs w:val="0"/>
+        </w:rPr>
+        <w:t>Assignment 3A: Project Standup 1</w:t>
+      </w:r>
+      <w:r>
+        <w:rPr>
+          <w:b w:val="0"/>
+          <w:bCs w:val="0"/>
+        </w:rPr>
+        <w:t>.</w:t>
+      </w:r>
+    </w:p>
+    <w:p>
+      <w:pPr>
+        <w:pStyle w:val="Heading5"/>
+        <w:rPr>
+          <w:b w:val="0"/>
+          <w:bCs w:val="0"/>
+        </w:rPr>
+      </w:pPr>
+      <w:r>
+        <w:rPr>
+          <w:b w:val="0"/>
+          <w:bCs w:val="0"/>
+        </w:rPr>
+        <w:t>Clean and process the selected Life Expectancy and Health Expenditure and Financing datasets in preparation for visualisation.</w:t>
+      </w:r>
+    </w:p>
+    <w:p>
+      <w:pPr>
+        <w:pStyle w:val="Heading5"/>
+        <w:rPr>
+          <w:b w:val="0"/>
+          <w:bCs w:val="0"/>
+        </w:rPr>
+      </w:pPr>
+      <w:r>
+        <w:rPr>
+          <w:b w:val="0"/>
+          <w:bCs w:val="0"/>
+        </w:rPr>
+        <w:t>Finalise the website design and layout.</w:t>
+      </w:r>
+    </w:p>
+    <w:p>
+      <w:pPr>
+        <w:pStyle w:val="Heading5"/>
+        <w:rPr>
+          <w:b w:val="0"/>
+          <w:bCs w:val="0"/>
+        </w:rPr>
+      </w:pPr>
+      <w:r>
+        <w:rPr>
+          <w:b w:val="0"/>
+          <w:bCs w:val="0"/>
+        </w:rPr>
+        <w:t>Develop initial visualisation concepts by evaluating the suitability of scatter plots, line charts, or a combination of both.</w:t>
+      </w:r>
+    </w:p>
+    <w:p/>
+    <w:p>
+      <w:pPr>
+        <w:pStyle w:val="Heading1"/>
+        <w:jc w:val="center"/>
+      </w:pPr>
+      <w:bookmarkStart w:id="2" w:name="_Toc239546168"/>
+      <w:r>
+        <w:t>Team</w:t>
+      </w:r>
+      <w:r>
+        <w:t xml:space="preserve"> </w:t>
+      </w:r>
+      <w:r>
+        <w:t>Tools</w:t>
+      </w:r>
+      <w:bookmarkEnd w:id="2"/>
+    </w:p>
+    <w:p>
+      <w:r>
+        <w:t xml:space="preserve">The team has agreed to utilise GitHub for version control and shared documentation storage. </w:t>
+      </w:r>
+      <w:r>
+        <w:t>Microsoft Teams is utilised</w:t>
+      </w:r>
+      <w:r>
+        <w:t xml:space="preserve"> as a communication channel.</w:t>
+      </w:r>
+    </w:p>
+    <w:p>
+      <w:r>
+        <w:t>Below is e</w:t>
+      </w:r>
+      <w:r>
+        <w:t>vidence of each te</w:t>
+      </w:r>
+      <w:r>
+        <w:t>a</w:t>
+      </w:r>
+      <w:r>
+        <w:t xml:space="preserve">m member </w:t>
+      </w:r>
+      <w:r>
+        <w:t xml:space="preserve">successfully </w:t>
+      </w:r>
+      <w:r>
+        <w:t xml:space="preserve">logged into the team tools. </w:t>
+      </w:r>
+    </w:p>
+    <w:p/>
+    <w:p>
+      <w:pPr>
+        <w:rPr>
+          <w:b/>
+          <w:bCs/>
+        </w:rPr>
+      </w:pPr>
+      <w:r>
+        <w:rPr>
+          <w:b/>
+          <w:bCs/>
+        </w:rPr>
+        <w:t xml:space="preserve">GitHub </w:t>
+      </w:r>
+      <w:r>
+        <w:rPr>
+          <w:b/>
+          <w:bCs/>
+        </w:rPr>
+        <w:t>R</w:t>
+      </w:r>
+      <w:r>
+        <w:rPr>
+          <w:b/>
+          <w:bCs/>
+        </w:rPr>
+        <w:t>epository</w:t>
+      </w:r>
+      <w:r>
+        <w:rPr>
+          <w:b/>
+          <w:bCs/>
+        </w:rPr>
+        <w:t xml:space="preserve"> + </w:t>
+      </w:r>
+      <w:r>
+        <w:rPr>
+          <w:b/>
+          <w:bCs/>
+        </w:rPr>
+        <w:t>Shared drive/documentation</w:t>
+      </w:r>
+    </w:p>
+    <w:tbl>
+      <w:tblPr>
+        <w:tblStyle w:val="TableGrid"/>
+        <w:tblW w:w="5000" w:type="pct"/>
+        <w:tblLook w:val="04A0" w:firstRow="1" w:lastRow="0" w:firstColumn="1" w:lastColumn="0" w:noHBand="0" w:noVBand="1"/>
+      </w:tblPr>
+      <w:tblGrid>
+        <w:gridCol w:w="10456"/>
+      </w:tblGrid>
+      <w:tr>
+        <w:tc>
+          <w:tcPr>
+            <w:tcW w:w="5000" w:type="pct"/>
+          </w:tcPr>
+          <w:p>
+            <w:pPr>
+              <w:jc w:val="center"/>
+              <w:rPr>
+                <w:b/>
+                <w:bCs/>
+              </w:rPr>
+            </w:pPr>
+            <w:r>
+              <w:rPr>
+                <w:b/>
+                <w:bCs/>
+              </w:rPr>
+              <w:t>Syed</w:t>
+            </w:r>
+          </w:p>
+          <w:p>
+            <w:pPr>
+              <w:jc w:val="center"/>
+              <w:rPr>
+                <w:b/>
+                <w:bCs/>
+              </w:rPr>
+            </w:pPr>
+            <w:r>
+              <w:rPr>
+                <w:b/>
+                <w:bCs/>
+                <w:noProof/>
+                <w:sz w:val="28"/>
+                <w:szCs w:val="28"/>
+              </w:rPr>
+              <w:drawing>
+                <wp:inline distT="0" distB="0" distL="0" distR="0" wp14:anchorId="5FDB4824" wp14:editId="3E224F30">
+                  <wp:extent cx="4866902" cy="2283012"/>
+                  <wp:effectExtent l="0" t="0" r="0" b="3175"/>
+                  <wp:docPr id="1683608470" name="Picture 1"/>
+                  <wp:cNvGraphicFramePr>
+                    <a:graphicFrameLocks xmlns:a="http://schemas.openxmlformats.org/drawingml/2006/main" noChangeAspect="1"/>
+                  </wp:cNvGraphicFramePr>
+                  <a:graphic xmlns:a="http://schemas.openxmlformats.org/drawingml/2006/main">
+                    <a:graphicData uri="http://schemas.openxmlformats.org/drawingml/2006/picture">
+                      <pic:pic xmlns:pic="http://schemas.openxmlformats.org/drawingml/2006/picture">
+                        <pic:nvPicPr>
+                          <pic:cNvPr id="1683608470" name=""/>
+                          <pic:cNvPicPr/>
+                        </pic:nvPicPr>
+                        <pic:blipFill>
+                          <a:blip r:embed="rId10"/>
+                          <a:stretch>
+                            <a:fillRect/>
+                          </a:stretch>
+                        </pic:blipFill>
+                        <pic:spPr>
+                          <a:xfrm>
+                            <a:off x="0" y="0"/>
+                            <a:ext cx="4952210" cy="2323029"/>
+                          </a:xfrm>
+                          <a:prstGeom prst="rect">
+                            <a:avLst/>
+                          </a:prstGeom>
+                        </pic:spPr>
+                      </pic:pic>
+                    </a:graphicData>
+                  </a:graphic>
+                </wp:inline>
+              </w:drawing>
+            </w:r>
+          </w:p>
+        </w:tc>
+      </w:tr>
+      <w:tr>
+        <w:tc>
+          <w:tcPr>
+            <w:tcW w:w="5000" w:type="pct"/>
+          </w:tcPr>
+          <w:p>
+            <w:pPr>
+              <w:jc w:val="center"/>
+              <w:rPr>
+                <w:b/>
+                <w:bCs/>
+                <w:noProof/>
+                <w:sz w:val="28"/>
+                <w:szCs w:val="28"/>
+              </w:rPr>
+            </w:pPr>
+            <w:r>
+              <w:rPr>
+                <w:b/>
+                <w:bCs/>
+                <w:noProof/>
+                <w:sz w:val="28"/>
+                <w:szCs w:val="28"/>
+              </w:rPr>
+              <w:lastRenderedPageBreak/>
+              <w:t>Dilhani</w:t>
+            </w:r>
+          </w:p>
+          <w:p>
+            <w:pPr>
+              <w:jc w:val="center"/>
+              <w:rPr>
+                <w:b/>
+                <w:bCs/>
+                <w:noProof/>
+                <w:sz w:val="28"/>
+                <w:szCs w:val="28"/>
+              </w:rPr>
+            </w:pPr>
+            <w:r>
+              <w:rPr>
+                <w:b/>
+                <w:bCs/>
+                <w:noProof/>
+                <w14:ligatures w14:val="standardContextual"/>
+              </w:rPr>
+              <w:drawing>
+                <wp:inline distT="0" distB="0" distL="0" distR="0" wp14:anchorId="3F6B6197" wp14:editId="527D5246">
+                  <wp:extent cx="4309035" cy="1824244"/>
+                  <wp:effectExtent l="0" t="0" r="0" b="5080"/>
+                  <wp:docPr id="929034780" name="Picture 1"/>
+                  <wp:cNvGraphicFramePr>
+                    <a:graphicFrameLocks xmlns:a="http://schemas.openxmlformats.org/drawingml/2006/main" noChangeAspect="1"/>
+                  </wp:cNvGraphicFramePr>
+                  <a:graphic xmlns:a="http://schemas.openxmlformats.org/drawingml/2006/main">
+                    <a:graphicData uri="http://schemas.openxmlformats.org/drawingml/2006/picture">
+                      <pic:pic xmlns:pic="http://schemas.openxmlformats.org/drawingml/2006/picture">
+                        <pic:nvPicPr>
+                          <pic:cNvPr id="929034780" name="Picture 929034780"/>
+                          <pic:cNvPicPr/>
+                        </pic:nvPicPr>
+                        <pic:blipFill>
+                          <a:blip r:embed="rId11" cstate="print">
+                            <a:extLst>
+                              <a:ext uri="{28A0092B-C50C-407E-A947-70E740481C1C}">
+                                <a14:useLocalDpi xmlns:a14="http://schemas.microsoft.com/office/drawing/2010/main" val="0"/>
+                              </a:ext>
+                            </a:extLst>
+                          </a:blip>
+                          <a:stretch>
+                            <a:fillRect/>
+                          </a:stretch>
+                        </pic:blipFill>
+                        <pic:spPr>
+                          <a:xfrm>
+                            <a:off x="0" y="0"/>
+                            <a:ext cx="4351310" cy="1842141"/>
+                          </a:xfrm>
+                          <a:prstGeom prst="rect">
+                            <a:avLst/>
+                          </a:prstGeom>
+                        </pic:spPr>
+                      </pic:pic>
+                    </a:graphicData>
+                  </a:graphic>
+                </wp:inline>
+              </w:drawing>
+            </w:r>
+          </w:p>
+        </w:tc>
+      </w:tr>
+    </w:tbl>
+    <w:p>
+      <w:pPr>
+        <w:rPr>
+          <w:b/>
+          <w:bCs/>
+        </w:rPr>
+      </w:pPr>
+    </w:p>
+    <w:p>
+      <w:pPr>
+        <w:rPr>
+          <w:b/>
+          <w:bCs/>
+        </w:rPr>
+      </w:pPr>
+      <w:r>
+        <w:rPr>
+          <w:b/>
+          <w:bCs/>
+        </w:rPr>
+        <w:t>Communication channel</w:t>
+      </w:r>
+    </w:p>
+    <w:tbl>
+      <w:tblPr>
+        <w:tblStyle w:val="TableGrid"/>
+        <w:tblW w:w="5000" w:type="pct"/>
+        <w:tblLook w:val="04A0" w:firstRow="1" w:lastRow="0" w:firstColumn="1" w:lastColumn="0" w:noHBand="0" w:noVBand="1"/>
+      </w:tblPr>
+      <w:tblGrid>
+        <w:gridCol w:w="10456"/>
+      </w:tblGrid>
+      <w:tr>
+        <w:tc>
+          <w:tcPr>
+            <w:tcW w:w="5000" w:type="pct"/>
+          </w:tcPr>
+          <w:p>
+            <w:pPr>
+              <w:jc w:val="center"/>
+              <w:rPr>
+                <w:b/>
+                <w:bCs/>
+              </w:rPr>
+            </w:pPr>
+            <w:r>
+              <w:rPr>
+                <w:b/>
+                <w:bCs/>
+              </w:rPr>
+              <w:t>Syed</w:t>
+            </w:r>
+          </w:p>
+          <w:p>
+            <w:pPr>
+              <w:jc w:val="center"/>
+              <w:rPr>
+                <w:b/>
+                <w:bCs/>
+              </w:rPr>
+            </w:pPr>
+            <w:r>
+              <w:rPr>
+                <w:b/>
+                <w:bCs/>
+                <w:noProof/>
+                <w:sz w:val="28"/>
+                <w:szCs w:val="28"/>
+              </w:rPr>
+              <w:drawing>
+                <wp:inline distT="0" distB="0" distL="0" distR="0" wp14:anchorId="540A9DE9" wp14:editId="3658CD42">
+                  <wp:extent cx="3048000" cy="2703443"/>
+                  <wp:effectExtent l="0" t="0" r="3810" b="1905"/>
+                  <wp:docPr id="1377836744" name="Picture 1"/>
+                  <wp:cNvGraphicFramePr>
+                    <a:graphicFrameLocks xmlns:a="http://schemas.openxmlformats.org/drawingml/2006/main" noChangeAspect="1"/>
+                  </wp:cNvGraphicFramePr>
+                  <a:graphic xmlns:a="http://schemas.openxmlformats.org/drawingml/2006/main">
+                    <a:graphicData uri="http://schemas.openxmlformats.org/drawingml/2006/picture">
+                      <pic:pic xmlns:pic="http://schemas.openxmlformats.org/drawingml/2006/picture">
+                        <pic:nvPicPr>
+                          <pic:cNvPr id="1377836744" name=""/>
+                          <pic:cNvPicPr/>
+                        </pic:nvPicPr>
+                        <pic:blipFill>
+                          <a:blip r:embed="rId12"/>
+                          <a:stretch>
+                            <a:fillRect/>
+                          </a:stretch>
+                        </pic:blipFill>
+                        <pic:spPr>
+                          <a:xfrm>
+                            <a:off x="0" y="0"/>
+                            <a:ext cx="3048000" cy="2703443"/>
+                          </a:xfrm>
+                          <a:prstGeom prst="rect">
+                            <a:avLst/>
+                          </a:prstGeom>
+                        </pic:spPr>
+                      </pic:pic>
+                    </a:graphicData>
+                  </a:graphic>
+                </wp:inline>
+              </w:drawing>
+            </w:r>
+          </w:p>
+        </w:tc>
+      </w:tr>
+      <w:tr>
+        <w:tc>
+          <w:tcPr>
+            <w:tcW w:w="5000" w:type="pct"/>
+          </w:tcPr>
+          <w:p>
+            <w:pPr>
+              <w:jc w:val="center"/>
+              <w:rPr>
+                <w:b/>
+                <w:bCs/>
+                <w:noProof/>
+                <w:sz w:val="28"/>
+                <w:szCs w:val="28"/>
+              </w:rPr>
+            </w:pPr>
+            <w:r>
+              <w:rPr>
+                <w:b/>
+                <w:bCs/>
+                <w:noProof/>
+                <w:sz w:val="28"/>
+                <w:szCs w:val="28"/>
+              </w:rPr>
+              <w:t>Dilhani</w:t>
+            </w:r>
+          </w:p>
+          <w:p>
+            <w:pPr>
+              <w:jc w:val="center"/>
+              <w:rPr>
+                <w:b/>
+                <w:bCs/>
+                <w:noProof/>
+                <w:sz w:val="28"/>
+                <w:szCs w:val="28"/>
+              </w:rPr>
+            </w:pPr>
+            <w:r>
+              <w:rPr>
+                <w:b/>
+                <w:bCs/>
+                <w:noProof/>
+                <w:sz w:val="28"/>
+                <w:szCs w:val="28"/>
+                <w14:ligatures w14:val="standardContextual"/>
+              </w:rPr>
+              <w:drawing>
+                <wp:inline distT="0" distB="0" distL="0" distR="0" wp14:anchorId="6A8848B2" wp14:editId="36902236">
+                  <wp:extent cx="3942496" cy="2755153"/>
+                  <wp:effectExtent l="0" t="0" r="0" b="1270"/>
+                  <wp:docPr id="1057420938" name="Picture 2"/>
+                  <wp:cNvGraphicFramePr>
+                    <a:graphicFrameLocks xmlns:a="http://schemas.openxmlformats.org/drawingml/2006/main" noChangeAspect="1"/>
+                  </wp:cNvGraphicFramePr>
+                  <a:graphic xmlns:a="http://schemas.openxmlformats.org/drawingml/2006/main">
+                    <a:graphicData uri="http://schemas.openxmlformats.org/drawingml/2006/picture">
+                      <pic:pic xmlns:pic="http://schemas.openxmlformats.org/drawingml/2006/picture">
+                        <pic:nvPicPr>
+                          <pic:cNvPr id="1057420938" name="Picture 1057420938"/>
+                          <pic:cNvPicPr/>
+                        </pic:nvPicPr>
+                        <pic:blipFill>
+                          <a:blip r:embed="rId13" cstate="print">
+                            <a:extLst>
+                              <a:ext uri="{28A0092B-C50C-407E-A947-70E740481C1C}">
+                                <a14:useLocalDpi xmlns:a14="http://schemas.microsoft.com/office/drawing/2010/main" val="0"/>
+                              </a:ext>
+                            </a:extLst>
+                          </a:blip>
+                          <a:stretch>
+                            <a:fillRect/>
+                          </a:stretch>
+                        </pic:blipFill>
+                        <pic:spPr>
+                          <a:xfrm>
+                            <a:off x="0" y="0"/>
+                            <a:ext cx="3986469" cy="2785883"/>
+                          </a:xfrm>
+                          <a:prstGeom prst="rect">
+                            <a:avLst/>
+                          </a:prstGeom>
+                        </pic:spPr>
+                      </pic:pic>
+                    </a:graphicData>
+                  </a:graphic>
+                </wp:inline>
+              </w:drawing>
+            </w:r>
+          </w:p>
+        </w:tc>
+      </w:tr>
+    </w:tbl>
+    <w:p>
+      <w:pPr>
+        <w:pStyle w:val="Heading1"/>
+        <w:jc w:val="center"/>
+      </w:pPr>
+      <w:bookmarkStart w:id="3" w:name="_Toc239546169"/>
+      <w:r>
+        <w:lastRenderedPageBreak/>
+        <w:t>Project Schedule</w:t>
+      </w:r>
+      <w:bookmarkEnd w:id="3"/>
+    </w:p>
+    <w:p>
+      <w:r>
+        <w:t xml:space="preserve">The project has been compartmentalised into 6 phases to </w:t>
+      </w:r>
+      <w:r>
+        <w:t>categorise</w:t>
+      </w:r>
+      <w:r>
+        <w:t xml:space="preserve"> progres</w:t>
+      </w:r>
+      <w:r>
+        <w:t>s</w:t>
+      </w:r>
+      <w:r>
+        <w:t>:</w:t>
+      </w:r>
+    </w:p>
+    <w:p>
+      <w:pPr>
+        <w:pStyle w:val="Heading5"/>
+        <w:rPr>
+          <w:b w:val="0"/>
+          <w:bCs w:val="0"/>
+        </w:rPr>
+      </w:pPr>
+      <w:r>
+        <w:rPr>
+          <w:b w:val="0"/>
+          <w:bCs w:val="0"/>
+        </w:rPr>
+        <w:t>Project Initiation &amp; Planning</w:t>
+      </w:r>
+    </w:p>
+    <w:p>
+      <w:pPr>
+        <w:pStyle w:val="Heading5"/>
+        <w:rPr>
+          <w:b w:val="0"/>
+          <w:bCs w:val="0"/>
+        </w:rPr>
+      </w:pPr>
+      <w:r>
+        <w:rPr>
+          <w:b w:val="0"/>
+          <w:bCs w:val="0"/>
+        </w:rPr>
+        <w:t>Project Setup &amp; Data Collection</w:t>
+      </w:r>
+    </w:p>
+    <w:p>
+      <w:pPr>
+        <w:pStyle w:val="Heading5"/>
+        <w:rPr>
+          <w:b w:val="0"/>
+          <w:bCs w:val="0"/>
+        </w:rPr>
+      </w:pPr>
+      <w:r>
+        <w:rPr>
+          <w:b w:val="0"/>
+          <w:bCs w:val="0"/>
+        </w:rPr>
+        <w:t>Data Preparation &amp; Design</w:t>
+      </w:r>
+    </w:p>
+    <w:p>
+      <w:pPr>
+        <w:pStyle w:val="Heading5"/>
+        <w:rPr>
+          <w:b w:val="0"/>
+          <w:bCs w:val="0"/>
+        </w:rPr>
+      </w:pPr>
+      <w:r>
+        <w:rPr>
+          <w:b w:val="0"/>
+          <w:bCs w:val="0"/>
+        </w:rPr>
+        <w:t>Development &amp; Implementation</w:t>
+      </w:r>
+    </w:p>
+    <w:p>
+      <w:pPr>
+        <w:pStyle w:val="Heading5"/>
+        <w:rPr>
+          <w:b w:val="0"/>
+          <w:bCs w:val="0"/>
+        </w:rPr>
+      </w:pPr>
+      <w:r>
+        <w:rPr>
+          <w:b w:val="0"/>
+          <w:bCs w:val="0"/>
+        </w:rPr>
+        <w:t>Testing, Evaluation &amp; Reflection</w:t>
+      </w:r>
+    </w:p>
+    <w:p>
+      <w:pPr>
+        <w:pStyle w:val="Heading5"/>
+        <w:rPr>
+          <w:b w:val="0"/>
+          <w:bCs w:val="0"/>
+        </w:rPr>
+      </w:pPr>
+      <w:r>
+        <w:rPr>
+          <w:b w:val="0"/>
+          <w:bCs w:val="0"/>
+        </w:rPr>
+        <w:t>Finalisation &amp; Submission</w:t>
+      </w:r>
+    </w:p>
+    <w:p/>
+    <w:tbl>
+      <w:tblPr>
+        <w:tblStyle w:val="TableGridLight"/>
+        <w:tblW w:w="0" w:type="auto"/>
+        <w:tblLook w:val="04A0" w:firstRow="1" w:lastRow="0" w:firstColumn="1" w:lastColumn="0" w:noHBand="0" w:noVBand="1"/>
+      </w:tblPr>
+      <w:tblGrid>
+        <w:gridCol w:w="1555"/>
+        <w:gridCol w:w="6520"/>
+        <w:gridCol w:w="2381"/>
+      </w:tblGrid>
+      <w:tr>
+        <w:tc>
+          <w:tcPr>
+            <w:tcW w:w="1555" w:type="dxa"/>
+            <w:shd w:val="clear" w:color="auto" w:fill="D1D1D1" w:themeFill="background2" w:themeFillShade="E6"/>
+            <w:hideMark/>
+          </w:tcPr>
+          <w:p>
+            <w:pPr>
+              <w:spacing w:before="120" w:after="120" w:line="240" w:lineRule="auto"/>
+              <w:rPr>
+                <w:b/>
+                <w:bCs/>
+              </w:rPr>
+            </w:pPr>
+            <w:r>
+              <w:rPr>
+                <w:b/>
+                <w:bCs/>
+              </w:rPr>
+              <w:t>Period</w:t>
+            </w:r>
+          </w:p>
+        </w:tc>
+        <w:tc>
+          <w:tcPr>
+            <w:tcW w:w="6520" w:type="dxa"/>
+            <w:shd w:val="clear" w:color="auto" w:fill="D1D1D1" w:themeFill="background2" w:themeFillShade="E6"/>
+            <w:hideMark/>
+          </w:tcPr>
+          <w:p>
+            <w:pPr>
+              <w:spacing w:before="120" w:after="120" w:line="240" w:lineRule="auto"/>
+              <w:rPr>
+                <w:b/>
+                <w:bCs/>
+              </w:rPr>
+            </w:pPr>
+            <w:r>
+              <w:rPr>
+                <w:b/>
+                <w:bCs/>
+              </w:rPr>
+              <w:t>Planned Work</w:t>
+            </w:r>
+          </w:p>
+        </w:tc>
+        <w:tc>
+          <w:tcPr>
+            <w:tcW w:w="2381" w:type="dxa"/>
+            <w:shd w:val="clear" w:color="auto" w:fill="D1D1D1" w:themeFill="background2" w:themeFillShade="E6"/>
+          </w:tcPr>
+          <w:p>
+            <w:pPr>
+              <w:spacing w:before="120" w:after="120" w:line="240" w:lineRule="auto"/>
+              <w:rPr>
+                <w:b/>
+                <w:bCs/>
+              </w:rPr>
+            </w:pPr>
+            <w:r>
+              <w:rPr>
+                <w:b/>
+                <w:bCs/>
+              </w:rPr>
+              <w:t>Assessment Due</w:t>
+            </w:r>
+          </w:p>
+        </w:tc>
+      </w:tr>
+      <w:tr>
+        <w:tc>
+          <w:tcPr>
+            <w:tcW w:w="1555" w:type="dxa"/>
+            <w:hideMark/>
+          </w:tcPr>
+          <w:p>
+            <w:pPr>
+              <w:spacing w:before="120" w:after="120" w:line="240" w:lineRule="auto"/>
+            </w:pPr>
+            <w:r>
+              <w:t>Weeks 4</w:t>
+            </w:r>
+            <w:r>
+              <w:t xml:space="preserve"> + </w:t>
+            </w:r>
+            <w:r>
+              <w:t>5</w:t>
+            </w:r>
+          </w:p>
+        </w:tc>
+        <w:tc>
+          <w:tcPr>
+            <w:tcW w:w="6520" w:type="dxa"/>
+            <w:hideMark/>
+          </w:tcPr>
+          <w:p>
+            <w:pPr>
+              <w:pStyle w:val="Heading5"/>
+              <w:numPr>
+                <w:ilvl w:val="0"/>
+                <w:numId w:val="44"/>
+              </w:numPr>
+            </w:pPr>
+            <w:r>
+              <w:t xml:space="preserve">Project </w:t>
+            </w:r>
+            <w:r>
+              <w:t xml:space="preserve">Initiation </w:t>
+            </w:r>
+            <w:r>
+              <w:rPr>
+                <w:rStyle w:val="Heading5Char"/>
+                <w:b/>
+                <w:bCs/>
+              </w:rPr>
+              <w:t>&amp; Planning</w:t>
+            </w:r>
+          </w:p>
+          <w:p>
+            <w:pPr>
+              <w:pStyle w:val="ListParagraph"/>
+              <w:numPr>
+                <w:ilvl w:val="0"/>
+                <w:numId w:val="37"/>
+              </w:numPr>
+              <w:spacing w:before="120" w:after="120" w:line="240" w:lineRule="auto"/>
+              <w:ind w:left="357" w:hanging="357"/>
+              <w:contextualSpacing w:val="0"/>
+            </w:pPr>
+            <w:r>
+              <w:t>Establish team communication</w:t>
+            </w:r>
+            <w:r>
+              <w:t xml:space="preserve"> and collaboration channels.</w:t>
+            </w:r>
+          </w:p>
+          <w:p>
+            <w:pPr>
+              <w:pStyle w:val="ListParagraph"/>
+              <w:numPr>
+                <w:ilvl w:val="0"/>
+                <w:numId w:val="37"/>
+              </w:numPr>
+              <w:spacing w:before="120" w:after="120" w:line="240" w:lineRule="auto"/>
+              <w:ind w:left="357" w:hanging="357"/>
+              <w:contextualSpacing w:val="0"/>
+            </w:pPr>
+            <w:r>
+              <w:t>Re</w:t>
+            </w:r>
+            <w:r>
+              <w:t xml:space="preserve">view </w:t>
+            </w:r>
+            <w:r>
+              <w:t>project</w:t>
+            </w:r>
+            <w:r>
+              <w:t xml:space="preserve"> requirements</w:t>
+            </w:r>
+            <w:r>
+              <w:t>.</w:t>
+            </w:r>
+          </w:p>
+          <w:p>
+            <w:pPr>
+              <w:pStyle w:val="ListParagraph"/>
+              <w:numPr>
+                <w:ilvl w:val="0"/>
+                <w:numId w:val="37"/>
+              </w:numPr>
+              <w:spacing w:before="120" w:after="120" w:line="240" w:lineRule="auto"/>
+              <w:ind w:left="357" w:hanging="357"/>
+              <w:contextualSpacing w:val="0"/>
+            </w:pPr>
+            <w:r>
+              <w:t>D</w:t>
+            </w:r>
+            <w:r>
+              <w:t>iscuss project topics.</w:t>
+            </w:r>
+          </w:p>
+        </w:tc>
+        <w:tc>
+          <w:tcPr>
+            <w:tcW w:w="2381" w:type="dxa"/>
+            <w:shd w:val="clear" w:color="auto" w:fill="E8E8E8" w:themeFill="background2"/>
+          </w:tcPr>
+          <w:p>
+            <w:pPr>
+              <w:spacing w:before="120" w:after="120" w:line="240" w:lineRule="auto"/>
+            </w:pPr>
+          </w:p>
+        </w:tc>
+      </w:tr>
+      <w:tr>
+        <w:tc>
+          <w:tcPr>
+            <w:tcW w:w="1555" w:type="dxa"/>
+            <w:hideMark/>
+          </w:tcPr>
+          <w:p>
+            <w:pPr>
+              <w:spacing w:before="120" w:after="120" w:line="240" w:lineRule="auto"/>
+            </w:pPr>
+            <w:r>
+              <w:t>Week 6</w:t>
+            </w:r>
+          </w:p>
+        </w:tc>
+        <w:tc>
+          <w:tcPr>
+            <w:tcW w:w="6520" w:type="dxa"/>
+            <w:hideMark/>
+          </w:tcPr>
+          <w:p>
+            <w:pPr>
+              <w:pStyle w:val="ListParagraph"/>
+              <w:numPr>
+                <w:ilvl w:val="0"/>
+                <w:numId w:val="38"/>
+              </w:numPr>
+              <w:spacing w:before="120" w:after="120" w:line="240" w:lineRule="auto"/>
+              <w:ind w:left="357" w:hanging="357"/>
+              <w:contextualSpacing w:val="0"/>
+            </w:pPr>
+            <w:r>
+              <w:t>Select OECD Health Statistics topic</w:t>
+            </w:r>
+            <w:r>
+              <w:t xml:space="preserve"> + </w:t>
+            </w:r>
+            <w:r>
+              <w:t xml:space="preserve">visualisation purpose </w:t>
+            </w:r>
+            <w:r>
+              <w:t>questions</w:t>
+            </w:r>
+            <w:r>
+              <w:t>.</w:t>
+            </w:r>
+          </w:p>
+          <w:p>
+            <w:pPr>
+              <w:pStyle w:val="ListParagraph"/>
+              <w:numPr>
+                <w:ilvl w:val="0"/>
+                <w:numId w:val="38"/>
+              </w:numPr>
+              <w:spacing w:before="120" w:after="120" w:line="240" w:lineRule="auto"/>
+              <w:ind w:left="357" w:hanging="357"/>
+              <w:contextualSpacing w:val="0"/>
+            </w:pPr>
+            <w:r>
+              <w:t>I</w:t>
+            </w:r>
+            <w:r>
+              <w:t>dentify datasets</w:t>
+            </w:r>
+            <w:r>
+              <w:t xml:space="preserve"> to be utilised </w:t>
+            </w:r>
+            <w:r>
+              <w:t>for the visualisations</w:t>
+            </w:r>
+            <w:r>
+              <w:t>.</w:t>
+            </w:r>
+          </w:p>
+        </w:tc>
+        <w:tc>
+          <w:tcPr>
+            <w:tcW w:w="2381" w:type="dxa"/>
+            <w:shd w:val="clear" w:color="auto" w:fill="E8E8E8" w:themeFill="background2"/>
+          </w:tcPr>
+          <w:p>
+            <w:pPr>
+              <w:spacing w:before="120" w:after="120" w:line="240" w:lineRule="auto"/>
+            </w:pPr>
+          </w:p>
+        </w:tc>
+      </w:tr>
+      <w:tr>
+        <w:tc>
+          <w:tcPr>
+            <w:tcW w:w="1555" w:type="dxa"/>
+            <w:hideMark/>
+          </w:tcPr>
+          <w:p>
+            <w:pPr>
+              <w:spacing w:before="120" w:after="120" w:line="240" w:lineRule="auto"/>
+            </w:pPr>
+            <w:r>
+              <w:t>Week 7</w:t>
+            </w:r>
+          </w:p>
+        </w:tc>
+        <w:tc>
+          <w:tcPr>
+            <w:tcW w:w="6520" w:type="dxa"/>
+            <w:hideMark/>
+          </w:tcPr>
+          <w:p>
+            <w:pPr>
+              <w:pStyle w:val="Heading5"/>
+            </w:pPr>
+            <w:r>
+              <w:t>Project Setup &amp; Data Collection</w:t>
+            </w:r>
+          </w:p>
+          <w:p>
+            <w:pPr>
+              <w:pStyle w:val="ListParagraph"/>
+              <w:numPr>
+                <w:ilvl w:val="0"/>
+                <w:numId w:val="38"/>
+              </w:numPr>
+              <w:spacing w:before="120" w:after="120" w:line="240" w:lineRule="auto"/>
+              <w:ind w:left="357" w:hanging="357"/>
+              <w:contextualSpacing w:val="0"/>
+            </w:pPr>
+            <w:r>
+              <w:t>Create GitHub repository</w:t>
+            </w:r>
+            <w:r>
+              <w:t xml:space="preserve">. </w:t>
+            </w:r>
+          </w:p>
+          <w:p>
+            <w:pPr>
+              <w:pStyle w:val="ListParagraph"/>
+              <w:numPr>
+                <w:ilvl w:val="0"/>
+                <w:numId w:val="38"/>
+              </w:numPr>
+              <w:spacing w:before="120" w:after="120" w:line="240" w:lineRule="auto"/>
+              <w:ind w:left="357" w:hanging="357"/>
+              <w:contextualSpacing w:val="0"/>
+            </w:pPr>
+            <w:r>
+              <w:t>C</w:t>
+            </w:r>
+            <w:r>
+              <w:t>ollect datasets</w:t>
+            </w:r>
+            <w:r>
+              <w:t xml:space="preserve">. </w:t>
+            </w:r>
+          </w:p>
+          <w:p>
+            <w:pPr>
+              <w:pStyle w:val="ListParagraph"/>
+              <w:numPr>
+                <w:ilvl w:val="0"/>
+                <w:numId w:val="38"/>
+              </w:numPr>
+              <w:spacing w:before="120" w:after="120" w:line="240" w:lineRule="auto"/>
+              <w:ind w:left="357" w:hanging="357"/>
+              <w:contextualSpacing w:val="0"/>
+            </w:pPr>
+            <w:r>
+              <w:t>B</w:t>
+            </w:r>
+            <w:r>
+              <w:t>egin initial website development</w:t>
+            </w:r>
+            <w:r>
+              <w:t xml:space="preserve"> </w:t>
+            </w:r>
+            <w:r>
+              <w:t>(</w:t>
+            </w:r>
+            <w:r>
+              <w:t>excluding visualisations</w:t>
+            </w:r>
+            <w:r>
+              <w:t>)</w:t>
+            </w:r>
+            <w:r>
+              <w:t>.</w:t>
+            </w:r>
+          </w:p>
+        </w:tc>
+        <w:tc>
+          <w:tcPr>
+            <w:tcW w:w="2381" w:type="dxa"/>
+            <w:shd w:val="clear" w:color="auto" w:fill="E8E8E8" w:themeFill="background2"/>
+          </w:tcPr>
+          <w:p>
+            <w:pPr>
+              <w:spacing w:before="120" w:after="120" w:line="240" w:lineRule="auto"/>
+            </w:pPr>
+          </w:p>
+        </w:tc>
+      </w:tr>
+      <w:tr>
+        <w:tc>
+          <w:tcPr>
+            <w:tcW w:w="1555" w:type="dxa"/>
+            <w:hideMark/>
+          </w:tcPr>
+          <w:p>
+            <w:pPr>
+              <w:spacing w:before="120" w:after="120" w:line="240" w:lineRule="auto"/>
+            </w:pPr>
+            <w:r>
+              <w:t>Week 8</w:t>
+            </w:r>
+          </w:p>
+        </w:tc>
+        <w:tc>
+          <w:tcPr>
+            <w:tcW w:w="6520" w:type="dxa"/>
+            <w:hideMark/>
+          </w:tcPr>
+          <w:p>
+            <w:pPr>
+              <w:pStyle w:val="Heading5"/>
+            </w:pPr>
+            <w:r>
+              <w:t>Data Preparation &amp; Design</w:t>
+            </w:r>
+          </w:p>
+          <w:p>
+            <w:pPr>
+              <w:pStyle w:val="ListParagraph"/>
+              <w:numPr>
+                <w:ilvl w:val="0"/>
+                <w:numId w:val="39"/>
+              </w:numPr>
+              <w:spacing w:before="120" w:after="120" w:line="240" w:lineRule="auto"/>
+              <w:ind w:left="357" w:hanging="357"/>
+              <w:contextualSpacing w:val="0"/>
+            </w:pPr>
+            <w:r>
+              <w:t>Complete</w:t>
+            </w:r>
+            <w:r>
+              <w:t xml:space="preserve"> </w:t>
+            </w:r>
+            <w:r>
+              <w:t>standup 1 report</w:t>
+            </w:r>
+            <w:r>
+              <w:t>.</w:t>
+            </w:r>
+          </w:p>
+          <w:p>
+            <w:pPr>
+              <w:pStyle w:val="ListParagraph"/>
+              <w:numPr>
+                <w:ilvl w:val="0"/>
+                <w:numId w:val="39"/>
+              </w:numPr>
+              <w:spacing w:before="120" w:after="120" w:line="240" w:lineRule="auto"/>
+              <w:ind w:left="357" w:hanging="357"/>
+              <w:contextualSpacing w:val="0"/>
+            </w:pPr>
+            <w:r>
+              <w:t>D</w:t>
+            </w:r>
+            <w:r>
+              <w:t>ocument</w:t>
+            </w:r>
+            <w:r>
+              <w:t xml:space="preserve"> </w:t>
+            </w:r>
+            <w:r>
+              <w:t xml:space="preserve">the project </w:t>
+            </w:r>
+            <w:r>
+              <w:t xml:space="preserve">details for </w:t>
+            </w:r>
+            <w:r>
+              <w:t>the p</w:t>
+            </w:r>
+            <w:r>
+              <w:t>roject process book</w:t>
+            </w:r>
+            <w:r>
+              <w:t>.</w:t>
+            </w:r>
+          </w:p>
+        </w:tc>
+        <w:tc>
+          <w:tcPr>
+            <w:tcW w:w="2381" w:type="dxa"/>
+          </w:tcPr>
+          <w:p>
+            <w:pPr>
+              <w:spacing w:before="120" w:after="120" w:line="240" w:lineRule="auto"/>
+            </w:pPr>
+            <w:r>
+              <w:t>Assignment 3A:</w:t>
+            </w:r>
+            <w:r>
+              <w:t xml:space="preserve"> Project Standup 1</w:t>
+            </w:r>
+          </w:p>
+        </w:tc>
+      </w:tr>
+      <w:tr>
+        <w:tc>
+          <w:tcPr>
+            <w:tcW w:w="1555" w:type="dxa"/>
+            <w:hideMark/>
+          </w:tcPr>
+          <w:p>
+            <w:pPr>
+              <w:spacing w:before="120" w:after="120" w:line="240" w:lineRule="auto"/>
+            </w:pPr>
+            <w:r>
+              <w:t>Week 9</w:t>
+            </w:r>
+          </w:p>
+        </w:tc>
+        <w:tc>
+          <w:tcPr>
+            <w:tcW w:w="6520" w:type="dxa"/>
+            <w:hideMark/>
+          </w:tcPr>
+          <w:p>
+            <w:pPr>
+              <w:pStyle w:val="ListParagraph"/>
+              <w:numPr>
+                <w:ilvl w:val="0"/>
+                <w:numId w:val="40"/>
+              </w:numPr>
+              <w:spacing w:before="120" w:after="120" w:line="240" w:lineRule="auto"/>
+              <w:ind w:left="357" w:hanging="357"/>
+              <w:contextualSpacing w:val="0"/>
+            </w:pPr>
+            <w:r>
+              <w:t>Clean and process datasets</w:t>
+            </w:r>
+            <w:r>
+              <w:t>.</w:t>
+            </w:r>
+          </w:p>
+          <w:p>
+            <w:pPr>
+              <w:pStyle w:val="ListParagraph"/>
+              <w:numPr>
+                <w:ilvl w:val="0"/>
+                <w:numId w:val="40"/>
+              </w:numPr>
+              <w:spacing w:before="120" w:after="120" w:line="240" w:lineRule="auto"/>
+              <w:ind w:left="357" w:hanging="357"/>
+              <w:contextualSpacing w:val="0"/>
+            </w:pPr>
+            <w:r>
+              <w:t>Finalise web</w:t>
+            </w:r>
+            <w:r>
+              <w:t>site</w:t>
+            </w:r>
+            <w:r>
+              <w:t xml:space="preserve"> design.</w:t>
+            </w:r>
+          </w:p>
+          <w:p>
+            <w:pPr>
+              <w:pStyle w:val="ListParagraph"/>
+              <w:numPr>
+                <w:ilvl w:val="0"/>
+                <w:numId w:val="40"/>
+              </w:numPr>
+              <w:spacing w:before="120" w:after="120" w:line="240" w:lineRule="auto"/>
+              <w:ind w:left="357" w:hanging="357"/>
+              <w:contextualSpacing w:val="0"/>
+            </w:pPr>
+            <w:r>
+              <w:t>D</w:t>
+            </w:r>
+            <w:r>
+              <w:t>evelop initial visualisation concepts.</w:t>
+            </w:r>
+          </w:p>
+        </w:tc>
+        <w:tc>
+          <w:tcPr>
+            <w:tcW w:w="2381" w:type="dxa"/>
+            <w:shd w:val="clear" w:color="auto" w:fill="E8E8E8" w:themeFill="background2"/>
+          </w:tcPr>
+          <w:p>
+            <w:pPr>
+              <w:spacing w:before="120" w:after="120" w:line="240" w:lineRule="auto"/>
+            </w:pPr>
+          </w:p>
+        </w:tc>
+      </w:tr>
+      <w:tr>
+        <w:tc>
+          <w:tcPr>
+            <w:tcW w:w="1555" w:type="dxa"/>
+            <w:hideMark/>
+          </w:tcPr>
+          <w:p>
+            <w:pPr>
+              <w:spacing w:before="120" w:after="120" w:line="240" w:lineRule="auto"/>
+            </w:pPr>
+            <w:r>
+              <w:t>Week 10</w:t>
+            </w:r>
+          </w:p>
+        </w:tc>
+        <w:tc>
+          <w:tcPr>
+            <w:tcW w:w="6520" w:type="dxa"/>
+            <w:hideMark/>
+          </w:tcPr>
+          <w:p>
+            <w:pPr>
+              <w:pStyle w:val="Heading5"/>
+            </w:pPr>
+            <w:r>
+              <w:t>Development &amp; Implementation</w:t>
+            </w:r>
+          </w:p>
+          <w:p>
+            <w:pPr>
+              <w:pStyle w:val="ListParagraph"/>
+              <w:numPr>
+                <w:ilvl w:val="0"/>
+                <w:numId w:val="41"/>
+              </w:numPr>
+              <w:spacing w:before="120" w:after="120" w:line="240" w:lineRule="auto"/>
+              <w:contextualSpacing w:val="0"/>
+            </w:pPr>
+            <w:r>
+              <w:t>Develop D3 visualisations and interactive features.</w:t>
+            </w:r>
+          </w:p>
+          <w:p>
+            <w:pPr>
+              <w:pStyle w:val="ListParagraph"/>
+              <w:numPr>
+                <w:ilvl w:val="0"/>
+                <w:numId w:val="41"/>
+              </w:numPr>
+              <w:spacing w:before="120" w:after="120" w:line="240" w:lineRule="auto"/>
+              <w:contextualSpacing w:val="0"/>
+            </w:pPr>
+            <w:r>
+              <w:lastRenderedPageBreak/>
+              <w:t>Complete</w:t>
+            </w:r>
+            <w:r>
+              <w:t xml:space="preserve"> standup </w:t>
+            </w:r>
+            <w:r>
+              <w:t>2</w:t>
+            </w:r>
+            <w:r>
+              <w:t xml:space="preserve"> report.</w:t>
+            </w:r>
+          </w:p>
+        </w:tc>
+        <w:tc>
+          <w:tcPr>
+            <w:tcW w:w="2381" w:type="dxa"/>
+          </w:tcPr>
+          <w:p>
+            <w:pPr>
+              <w:spacing w:before="120" w:after="120" w:line="240" w:lineRule="auto"/>
+            </w:pPr>
+            <w:r>
+              <w:lastRenderedPageBreak/>
+              <w:t>Assignment 3A:</w:t>
+            </w:r>
+            <w:r>
+              <w:t xml:space="preserve"> Project Standup </w:t>
+            </w:r>
+            <w:r>
+              <w:t>2</w:t>
+            </w:r>
+          </w:p>
+        </w:tc>
+      </w:tr>
+      <w:tr>
+        <w:tc>
+          <w:tcPr>
+            <w:tcW w:w="1555" w:type="dxa"/>
+            <w:hideMark/>
+          </w:tcPr>
+          <w:p>
+            <w:pPr>
+              <w:spacing w:before="120" w:after="120" w:line="240" w:lineRule="auto"/>
+            </w:pPr>
+            <w:r>
+              <w:t>Week 11</w:t>
+            </w:r>
+          </w:p>
+        </w:tc>
+        <w:tc>
+          <w:tcPr>
+            <w:tcW w:w="6520" w:type="dxa"/>
+            <w:hideMark/>
+          </w:tcPr>
+          <w:p>
+            <w:pPr>
+              <w:pStyle w:val="ListParagraph"/>
+              <w:numPr>
+                <w:ilvl w:val="0"/>
+                <w:numId w:val="41"/>
+              </w:numPr>
+              <w:spacing w:before="120" w:after="120" w:line="240" w:lineRule="auto"/>
+              <w:contextualSpacing w:val="0"/>
+            </w:pPr>
+            <w:r>
+              <w:t xml:space="preserve">Refine </w:t>
+            </w:r>
+            <w:r>
+              <w:t xml:space="preserve">data </w:t>
+            </w:r>
+            <w:r>
+              <w:t>visualisations, website design and user interactions.</w:t>
+            </w:r>
+          </w:p>
+          <w:p>
+            <w:pPr>
+              <w:pStyle w:val="ListParagraph"/>
+              <w:numPr>
+                <w:ilvl w:val="0"/>
+                <w:numId w:val="41"/>
+              </w:numPr>
+              <w:spacing w:before="120" w:after="120" w:line="240" w:lineRule="auto"/>
+              <w:contextualSpacing w:val="0"/>
+            </w:pPr>
+            <w:r>
+              <w:t xml:space="preserve">Complete </w:t>
+            </w:r>
+            <w:r>
+              <w:t xml:space="preserve">standup </w:t>
+            </w:r>
+            <w:r>
+              <w:t>3</w:t>
+            </w:r>
+            <w:r>
+              <w:t xml:space="preserve"> report.</w:t>
+            </w:r>
+          </w:p>
+        </w:tc>
+        <w:tc>
+          <w:tcPr>
+            <w:tcW w:w="2381" w:type="dxa"/>
+          </w:tcPr>
+          <w:p>
+            <w:pPr>
+              <w:spacing w:before="120" w:after="120" w:line="240" w:lineRule="auto"/>
+            </w:pPr>
+            <w:r>
+              <w:t>Assignment 3A:</w:t>
+            </w:r>
+            <w:r>
+              <w:t xml:space="preserve"> Project Standup </w:t>
+            </w:r>
+            <w:r>
+              <w:t>3</w:t>
+            </w:r>
+          </w:p>
+        </w:tc>
+      </w:tr>
+      <w:tr>
+        <w:tc>
+          <w:tcPr>
+            <w:tcW w:w="1555" w:type="dxa"/>
+            <w:hideMark/>
+          </w:tcPr>
+          <w:p>
+            <w:pPr>
+              <w:spacing w:before="120" w:after="120" w:line="240" w:lineRule="auto"/>
+            </w:pPr>
+            <w:r>
+              <w:t>Week 12</w:t>
+            </w:r>
+          </w:p>
+        </w:tc>
+        <w:tc>
+          <w:tcPr>
+            <w:tcW w:w="6520" w:type="dxa"/>
+            <w:hideMark/>
+          </w:tcPr>
+          <w:p>
+            <w:pPr>
+              <w:pStyle w:val="Heading5"/>
+            </w:pPr>
+            <w:r>
+              <w:t>Testing, Evaluation &amp; Reflection</w:t>
+            </w:r>
+          </w:p>
+          <w:p>
+            <w:pPr>
+              <w:pStyle w:val="ListParagraph"/>
+              <w:numPr>
+                <w:ilvl w:val="0"/>
+                <w:numId w:val="41"/>
+              </w:numPr>
+              <w:spacing w:before="120" w:after="120" w:line="240" w:lineRule="auto"/>
+              <w:contextualSpacing w:val="0"/>
+            </w:pPr>
+            <w:r>
+              <w:t>Test the website and visualisations</w:t>
+            </w:r>
+            <w:r>
+              <w:t>.</w:t>
+            </w:r>
+          </w:p>
+          <w:p>
+            <w:pPr>
+              <w:pStyle w:val="ListParagraph"/>
+              <w:numPr>
+                <w:ilvl w:val="0"/>
+                <w:numId w:val="41"/>
+              </w:numPr>
+              <w:spacing w:before="120" w:after="120" w:line="240" w:lineRule="auto"/>
+              <w:contextualSpacing w:val="0"/>
+            </w:pPr>
+            <w:r>
+              <w:t>I</w:t>
+            </w:r>
+            <w:r>
+              <w:t>mplement improvements based on testing</w:t>
+            </w:r>
+            <w:r>
+              <w:t xml:space="preserve"> </w:t>
+            </w:r>
+          </w:p>
+          <w:p>
+            <w:pPr>
+              <w:pStyle w:val="ListParagraph"/>
+              <w:numPr>
+                <w:ilvl w:val="0"/>
+                <w:numId w:val="41"/>
+              </w:numPr>
+              <w:spacing w:before="120" w:after="120" w:line="240" w:lineRule="auto"/>
+              <w:contextualSpacing w:val="0"/>
+            </w:pPr>
+            <w:r>
+              <w:t xml:space="preserve">Complete </w:t>
+            </w:r>
+            <w:r>
+              <w:t xml:space="preserve">standup </w:t>
+            </w:r>
+            <w:r>
+              <w:t>4</w:t>
+            </w:r>
+            <w:r>
+              <w:t xml:space="preserve"> report.</w:t>
+            </w:r>
+          </w:p>
+          <w:p>
+            <w:pPr>
+              <w:pStyle w:val="ListParagraph"/>
+              <w:numPr>
+                <w:ilvl w:val="0"/>
+                <w:numId w:val="41"/>
+              </w:numPr>
+              <w:spacing w:before="120" w:after="120" w:line="240" w:lineRule="auto"/>
+              <w:contextualSpacing w:val="0"/>
+            </w:pPr>
+            <w:r>
+              <w:t>Commence</w:t>
+            </w:r>
+            <w:r>
+              <w:t xml:space="preserve"> project reflection and peer review.</w:t>
+            </w:r>
+          </w:p>
+        </w:tc>
+        <w:tc>
+          <w:tcPr>
+            <w:tcW w:w="2381" w:type="dxa"/>
+          </w:tcPr>
+          <w:p>
+            <w:pPr>
+              <w:spacing w:before="120" w:after="120" w:line="240" w:lineRule="auto"/>
+            </w:pPr>
+            <w:r>
+              <w:t>Assignment 3A:</w:t>
+            </w:r>
+            <w:r>
+              <w:t xml:space="preserve"> Project Standup </w:t>
+            </w:r>
+            <w:r>
+              <w:t>4</w:t>
+            </w:r>
+          </w:p>
+        </w:tc>
+      </w:tr>
+      <w:tr>
+        <w:tc>
+          <w:tcPr>
+            <w:tcW w:w="1555" w:type="dxa"/>
+            <w:hideMark/>
+          </w:tcPr>
+          <w:p>
+            <w:pPr>
+              <w:spacing w:before="120" w:after="120" w:line="240" w:lineRule="auto"/>
+            </w:pPr>
+            <w:r>
+              <w:t>Exam Period</w:t>
+            </w:r>
+          </w:p>
+        </w:tc>
+        <w:tc>
+          <w:tcPr>
+            <w:tcW w:w="6520" w:type="dxa"/>
+            <w:hideMark/>
+          </w:tcPr>
+          <w:p>
+            <w:pPr>
+              <w:pStyle w:val="Heading5"/>
+            </w:pPr>
+            <w:r>
+              <w:t>Finalisation &amp; Submission</w:t>
+            </w:r>
+          </w:p>
+          <w:p>
+            <w:pPr>
+              <w:pStyle w:val="ListParagraph"/>
+              <w:numPr>
+                <w:ilvl w:val="0"/>
+                <w:numId w:val="41"/>
+              </w:numPr>
+              <w:spacing w:before="120" w:after="120" w:line="240" w:lineRule="auto"/>
+              <w:ind w:left="357" w:hanging="357"/>
+              <w:contextualSpacing w:val="0"/>
+            </w:pPr>
+            <w:r>
+              <w:t>Finalise the Project Process Book</w:t>
+            </w:r>
+            <w:r>
+              <w:t xml:space="preserve"> for submission.</w:t>
+            </w:r>
+          </w:p>
+          <w:p>
+            <w:pPr>
+              <w:pStyle w:val="ListParagraph"/>
+              <w:numPr>
+                <w:ilvl w:val="0"/>
+                <w:numId w:val="41"/>
+              </w:numPr>
+              <w:spacing w:before="120" w:after="120" w:line="240" w:lineRule="auto"/>
+              <w:ind w:left="357" w:hanging="357"/>
+              <w:contextualSpacing w:val="0"/>
+            </w:pPr>
+            <w:r>
+              <w:t xml:space="preserve">Finalise the </w:t>
+            </w:r>
+            <w:r>
+              <w:t>Website and Visualisation for submission.</w:t>
+            </w:r>
+          </w:p>
+          <w:p>
+            <w:pPr>
+              <w:pStyle w:val="ListParagraph"/>
+              <w:numPr>
+                <w:ilvl w:val="0"/>
+                <w:numId w:val="41"/>
+              </w:numPr>
+              <w:spacing w:before="120" w:after="120" w:line="240" w:lineRule="auto"/>
+              <w:ind w:left="357" w:hanging="357"/>
+              <w:contextualSpacing w:val="0"/>
+            </w:pPr>
+            <w:r>
+              <w:t>Complete</w:t>
+            </w:r>
+            <w:r>
+              <w:t xml:space="preserve"> project reflection and peer review.</w:t>
+            </w:r>
+          </w:p>
+        </w:tc>
+        <w:tc>
+          <w:tcPr>
+            <w:tcW w:w="2381" w:type="dxa"/>
+          </w:tcPr>
+          <w:p>
+            <w:pPr>
+              <w:spacing w:before="120" w:after="120" w:line="240" w:lineRule="auto"/>
+            </w:pPr>
+            <w:r>
+              <w:t>Assignment 3B: Project process book</w:t>
+            </w:r>
+          </w:p>
+          <w:p>
+            <w:pPr>
+              <w:spacing w:before="120" w:after="120" w:line="240" w:lineRule="auto"/>
+            </w:pPr>
+            <w:r>
+              <w:t>Assignment 3C: Website and visualisation</w:t>
+            </w:r>
+          </w:p>
+          <w:p>
+            <w:pPr>
+              <w:spacing w:before="120" w:after="120" w:line="240" w:lineRule="auto"/>
+            </w:pPr>
+            <w:r>
+              <w:t>Assignment 3D: Project reflection and peer review</w:t>
+            </w:r>
+          </w:p>
+        </w:tc>
+      </w:tr>
+    </w:tbl>
+    <w:p>
+      <w:pPr>
+        <w:spacing w:before="100" w:beforeAutospacing="1" w:after="100" w:afterAutospacing="1" w:line="240" w:lineRule="auto"/>
+        <w:rPr>
+          <w:color w:val="272727"/>
+        </w:rPr>
+      </w:pPr>
+    </w:p>
+    <w:p>
+      <w:pPr>
+        <w:spacing w:line="240" w:lineRule="auto"/>
+        <w:rPr>
+          <w:rFonts w:eastAsiaTheme="majorEastAsia" w:cstheme="majorBidi"/>
+          <w:color w:val="156082" w:themeColor="accent1"/>
+          <w:sz w:val="36"/>
+          <w:szCs w:val="40"/>
+          <w:shd w:val="clear" w:color="auto" w:fill="FFFFFF"/>
+        </w:rPr>
+      </w:pPr>
+      <w:r>
+        <w:br w:type="page"/>
+      </w:r>
+    </w:p>
+    <w:p>
+      <w:pPr>
+        <w:pStyle w:val="Heading1"/>
+        <w:jc w:val="center"/>
+      </w:pPr>
+      <w:bookmarkStart w:id="4" w:name="_Toc239546170"/>
+      <w:r>
+        <w:lastRenderedPageBreak/>
+        <w:t>Teamwork Issues</w:t>
+      </w:r>
+      <w:bookmarkEnd w:id="4"/>
+    </w:p>
+    <w:tbl>
+      <w:tblPr>
+        <w:tblStyle w:val="TableGrid"/>
+        <w:tblW w:w="5000" w:type="pct"/>
+        <w:tblLook w:val="04A0" w:firstRow="1" w:lastRow="0" w:firstColumn="1" w:lastColumn="0" w:noHBand="0" w:noVBand="1"/>
+      </w:tblPr>
+      <w:tblGrid>
+        <w:gridCol w:w="5228"/>
+        <w:gridCol w:w="5228"/>
+      </w:tblGrid>
+      <w:tr>
+        <w:tc>
+          <w:tcPr>
+            <w:tcW w:w="2500" w:type="pct"/>
+            <w:shd w:val="clear" w:color="auto" w:fill="E8E8E8" w:themeFill="background2"/>
+          </w:tcPr>
+          <w:p>
+            <w:pPr>
+              <w:spacing w:before="60" w:after="60" w:line="240" w:lineRule="auto"/>
+              <w:jc w:val="center"/>
+              <w:rPr>
+                <w:b/>
+                <w:bCs/>
+              </w:rPr>
+            </w:pPr>
+            <w:r>
+              <w:rPr>
+                <w:b/>
+                <w:bCs/>
+              </w:rPr>
+              <w:t>Issue</w:t>
+            </w:r>
+          </w:p>
+        </w:tc>
+        <w:tc>
+          <w:tcPr>
+            <w:tcW w:w="2500" w:type="pct"/>
+            <w:shd w:val="clear" w:color="auto" w:fill="E8E8E8" w:themeFill="background2"/>
+          </w:tcPr>
+          <w:p>
+            <w:pPr>
+              <w:spacing w:before="60" w:after="60" w:line="240" w:lineRule="auto"/>
+              <w:jc w:val="center"/>
+              <w:rPr>
+                <w:b/>
+                <w:bCs/>
+              </w:rPr>
+            </w:pPr>
+            <w:r>
+              <w:rPr>
+                <w:b/>
+                <w:bCs/>
+              </w:rPr>
+              <w:t>Mitigation</w:t>
+            </w:r>
+          </w:p>
+        </w:tc>
+      </w:tr>
+      <w:tr>
+        <w:tc>
+          <w:tcPr>
+            <w:tcW w:w="2500" w:type="pct"/>
+          </w:tcPr>
+          <w:p>
+            <w:pPr>
+              <w:spacing w:before="60" w:after="60" w:line="240" w:lineRule="auto"/>
+            </w:pPr>
+            <w:r>
+              <w:t xml:space="preserve">The team has a conflict in schedules therefore a regular meeting time was unable to be scheduled, causing the team to communicate only via text. Although this was </w:t>
+            </w:r>
+            <w:r>
+              <w:t>navigated</w:t>
+            </w:r>
+            <w:r>
+              <w:t xml:space="preserve"> throughout the preparation phase, it can be foreseen as an issue for the project further down the track.</w:t>
+            </w:r>
+          </w:p>
+        </w:tc>
+        <w:tc>
+          <w:tcPr>
+            <w:tcW w:w="2500" w:type="pct"/>
+          </w:tcPr>
+          <w:p>
+            <w:pPr>
+              <w:spacing w:before="60" w:after="60" w:line="240" w:lineRule="auto"/>
+            </w:pPr>
+            <w:r>
+              <w:t xml:space="preserve">Regular meetings will be held on </w:t>
+            </w:r>
+            <w:r>
+              <w:t xml:space="preserve">midday, </w:t>
+            </w:r>
+            <w:r>
+              <w:t>Saturdays or Sundays</w:t>
+            </w:r>
+            <w:r>
+              <w:t xml:space="preserve"> moving forward.</w:t>
+            </w:r>
+            <w:r>
+              <w:t xml:space="preserve"> These are scheduled before assessment deadlines.</w:t>
+            </w:r>
+          </w:p>
+        </w:tc>
+      </w:tr>
+      <w:tr>
+        <w:tc>
+          <w:tcPr>
+            <w:tcW w:w="2500" w:type="pct"/>
+          </w:tcPr>
+          <w:p>
+            <w:pPr>
+              <w:spacing w:before="60" w:after="60" w:line="240" w:lineRule="auto"/>
+            </w:pPr>
+            <w:r>
+              <w:t>Inconsistent communication from Dilhani</w:t>
+            </w:r>
+            <w:r>
+              <w:t xml:space="preserve"> due to work commitments. </w:t>
+            </w:r>
+          </w:p>
+        </w:tc>
+        <w:tc>
+          <w:tcPr>
+            <w:tcW w:w="2500" w:type="pct"/>
+          </w:tcPr>
+          <w:p>
+            <w:pPr>
+              <w:spacing w:before="60" w:after="60" w:line="240" w:lineRule="auto"/>
+            </w:pPr>
+            <w:r>
+              <w:t>Dilhani has committed to regular</w:t>
+            </w:r>
+            <w:r>
+              <w:t xml:space="preserve"> updates with regards to tasks guided by </w:t>
+            </w:r>
+            <w:r>
+              <w:t xml:space="preserve">the </w:t>
+            </w:r>
+            <w:r>
+              <w:t xml:space="preserve">weekly </w:t>
+            </w:r>
+            <w:r>
+              <w:t>scheduled meetings</w:t>
+            </w:r>
+            <w:r>
+              <w:t xml:space="preserve"> as an internal deadline</w:t>
+            </w:r>
+            <w:r>
+              <w:t>.</w:t>
+            </w:r>
+            <w:r>
+              <w:t xml:space="preserve"> </w:t>
+            </w:r>
+          </w:p>
+        </w:tc>
+      </w:tr>
+    </w:tbl>
+    <w:p/>
+    <w:p>
+      <w:pPr>
+        <w:rPr>
+          <w:sz w:val="22"/>
+          <w:szCs w:val="22"/>
+        </w:rPr>
+      </w:pPr>
+      <w:bookmarkStart w:id="5" w:name="_Toc239546171"/>
+      <w:r>
+        <w:rPr>
+          <w:rStyle w:val="Heading2Char"/>
+          <w:sz w:val="28"/>
+          <w:szCs w:val="28"/>
+        </w:rPr>
+        <w:t>Overall risk mitigation</w:t>
+      </w:r>
+      <w:r>
+        <w:rPr>
+          <w:rStyle w:val="Heading2Char"/>
+          <w:sz w:val="28"/>
+          <w:szCs w:val="28"/>
+        </w:rPr>
+        <w:t xml:space="preserve"> strategy</w:t>
+      </w:r>
+      <w:r>
+        <w:rPr>
+          <w:rStyle w:val="Heading2Char"/>
+          <w:sz w:val="28"/>
+          <w:szCs w:val="28"/>
+        </w:rPr>
+        <w:t>:</w:t>
+      </w:r>
+      <w:bookmarkEnd w:id="5"/>
+    </w:p>
+    <w:tbl>
+      <w:tblPr>
+        <w:tblStyle w:val="TableGrid"/>
+        <w:tblW w:w="0" w:type="auto"/>
+        <w:tblLook w:val="04A0" w:firstRow="1" w:lastRow="0" w:firstColumn="1" w:lastColumn="0" w:noHBand="0" w:noVBand="1"/>
+      </w:tblPr>
+      <w:tblGrid>
+        <w:gridCol w:w="5228"/>
+        <w:gridCol w:w="5228"/>
+      </w:tblGrid>
+      <w:tr>
+        <w:tc>
+          <w:tcPr>
+            <w:tcW w:w="5228" w:type="dxa"/>
+            <w:shd w:val="clear" w:color="auto" w:fill="E8E8E8" w:themeFill="background2"/>
+          </w:tcPr>
+          <w:p>
+            <w:pPr>
+              <w:spacing w:before="60" w:after="60" w:line="240" w:lineRule="auto"/>
+              <w:jc w:val="center"/>
+              <w:rPr>
+                <w:b/>
+                <w:bCs/>
+              </w:rPr>
+            </w:pPr>
+            <w:r>
+              <w:rPr>
+                <w:b/>
+                <w:bCs/>
+              </w:rPr>
+              <w:t>Risk</w:t>
+            </w:r>
+          </w:p>
+        </w:tc>
+        <w:tc>
+          <w:tcPr>
+            <w:tcW w:w="5228" w:type="dxa"/>
+            <w:shd w:val="clear" w:color="auto" w:fill="E8E8E8" w:themeFill="background2"/>
+          </w:tcPr>
+          <w:p>
+            <w:pPr>
+              <w:spacing w:before="60" w:after="60" w:line="240" w:lineRule="auto"/>
+              <w:jc w:val="center"/>
+              <w:rPr>
+                <w:b/>
+                <w:bCs/>
+              </w:rPr>
+            </w:pPr>
+            <w:r>
+              <w:rPr>
+                <w:b/>
+                <w:bCs/>
+              </w:rPr>
+              <w:t>Mitigation</w:t>
+            </w:r>
+          </w:p>
+        </w:tc>
+      </w:tr>
+      <w:tr>
+        <w:tc>
+          <w:tcPr>
+            <w:tcW w:w="5228" w:type="dxa"/>
+          </w:tcPr>
+          <w:p>
+            <w:pPr>
+              <w:spacing w:before="60" w:after="60" w:line="240" w:lineRule="auto"/>
+            </w:pPr>
+            <w:r>
+              <w:t>Uneven workload distribution among team members</w:t>
+            </w:r>
+            <w:r>
+              <w:t>.</w:t>
+            </w:r>
+          </w:p>
+        </w:tc>
+        <w:tc>
+          <w:tcPr>
+            <w:tcW w:w="5228" w:type="dxa"/>
+          </w:tcPr>
+          <w:p>
+            <w:pPr>
+              <w:spacing w:before="60" w:after="60" w:line="240" w:lineRule="auto"/>
+            </w:pPr>
+            <w:r>
+              <w:t xml:space="preserve">Tasks will be </w:t>
+            </w:r>
+            <w:r>
+              <w:t xml:space="preserve">collaboratively </w:t>
+            </w:r>
+            <w:r>
+              <w:t xml:space="preserve">assigned to </w:t>
+            </w:r>
+            <w:r>
+              <w:t xml:space="preserve">each team member. </w:t>
+            </w:r>
+          </w:p>
+        </w:tc>
+      </w:tr>
+      <w:tr>
+        <w:tc>
+          <w:tcPr>
+            <w:tcW w:w="5228" w:type="dxa"/>
+          </w:tcPr>
+          <w:p>
+            <w:pPr>
+              <w:spacing w:before="60" w:after="60" w:line="240" w:lineRule="auto"/>
+            </w:pPr>
+            <w:r>
+              <w:t>A team member misses deadlines.</w:t>
+            </w:r>
+          </w:p>
+        </w:tc>
+        <w:tc>
+          <w:tcPr>
+            <w:tcW w:w="5228" w:type="dxa"/>
+          </w:tcPr>
+          <w:p>
+            <w:pPr>
+              <w:spacing w:before="60" w:after="60" w:line="240" w:lineRule="auto"/>
+            </w:pPr>
+            <w:r>
+              <w:t xml:space="preserve">Internal deadline </w:t>
+            </w:r>
+            <w:proofErr w:type="gramStart"/>
+            <w:r>
+              <w:t>are</w:t>
+            </w:r>
+            <w:proofErr w:type="gramEnd"/>
+            <w:r>
+              <w:t xml:space="preserve"> set before official due dates. Progress is monitored during standup meetings.</w:t>
+            </w:r>
+          </w:p>
+        </w:tc>
+      </w:tr>
+      <w:tr>
+        <w:tc>
+          <w:tcPr>
+            <w:tcW w:w="5228" w:type="dxa"/>
+          </w:tcPr>
+          <w:p>
+            <w:pPr>
+              <w:spacing w:before="60" w:after="60" w:line="240" w:lineRule="auto"/>
+            </w:pPr>
+            <w:r>
+              <w:t>Team conflicts or disagreements on project decisions.</w:t>
+            </w:r>
+          </w:p>
+        </w:tc>
+        <w:tc>
+          <w:tcPr>
+            <w:tcW w:w="5228" w:type="dxa"/>
+          </w:tcPr>
+          <w:p>
+            <w:pPr>
+              <w:spacing w:before="60" w:after="60" w:line="240" w:lineRule="auto"/>
+            </w:pPr>
+            <w:r>
+              <w:t>Open disc</w:t>
+            </w:r>
+            <w:r>
+              <w:t>u</w:t>
+            </w:r>
+            <w:r>
+              <w:t>ssions are held</w:t>
+            </w:r>
+            <w:r>
+              <w:t xml:space="preserve"> with outcomes documented. OLA will be engaged if required.</w:t>
+            </w:r>
+          </w:p>
+        </w:tc>
+      </w:tr>
+    </w:tbl>
     <w:p/>
     <w:sectPr>
-      <w:headerReference w:type="default" r:id="rId10"/>
-      <w:footerReference w:type="even" r:id="rId11"/>
-      <w:footerReference w:type="default" r:id="rId12"/>
+      <w:headerReference w:type="default" r:id="rId14"/>
+      <w:footerReference w:type="even" r:id="rId15"/>
+      <w:footerReference w:type="default" r:id="rId16"/>
       <w:pgSz w:w="11906" w:h="16838"/>
-      <w:pgMar w:top="1440" w:right="1080" w:bottom="1440" w:left="1080" w:header="708" w:footer="708" w:gutter="0"/>
+      <w:pgMar w:top="720" w:right="720" w:bottom="720" w:left="720" w:header="680" w:footer="283" w:gutter="0"/>
       <w:cols w:space="708"/>
       <w:titlePg/>
       <w:docGrid w:linePitch="360"/>
@@ -1013,6 +3639,12 @@
       <w:t>Team 1E</w:t>
     </w:r>
   </w:p>
+  <w:p>
+    <w:pPr>
+      <w:pStyle w:val="Header"/>
+      <w:jc w:val="center"/>
+    </w:pPr>
+  </w:p>
 </w:hdr>
 </file>
 
@@ -1132,6 +3764,92 @@
     </w:lvl>
   </w:abstractNum>
   <w:abstractNum w:abstractNumId="1" w15:restartNumberingAfterBreak="0">
+    <w:nsid w:val="02453E04"/>
+    <w:multiLevelType w:val="hybridMultilevel"/>
+    <w:tmpl w:val="CF1277CC"/>
+    <w:lvl w:ilvl="0" w:tplc="0809000F">
+      <w:start w:val="1"/>
+      <w:numFmt w:val="decimal"/>
+      <w:lvlText w:val="%1."/>
+      <w:lvlJc w:val="left"/>
+      <w:pPr>
+        <w:ind w:left="360" w:hanging="360"/>
+      </w:pPr>
+    </w:lvl>
+    <w:lvl w:ilvl="1" w:tplc="08090019" w:tentative="1">
+      <w:start w:val="1"/>
+      <w:numFmt w:val="lowerLetter"/>
+      <w:lvlText w:val="%2."/>
+      <w:lvlJc w:val="left"/>
+      <w:pPr>
+        <w:ind w:left="1080" w:hanging="360"/>
+      </w:pPr>
+    </w:lvl>
+    <w:lvl w:ilvl="2" w:tplc="0809001B" w:tentative="1">
+      <w:start w:val="1"/>
+      <w:numFmt w:val="lowerRoman"/>
+      <w:lvlText w:val="%3."/>
+      <w:lvlJc w:val="right"/>
+      <w:pPr>
+        <w:ind w:left="1800" w:hanging="180"/>
+      </w:pPr>
+    </w:lvl>
+    <w:lvl w:ilvl="3" w:tplc="0809000F" w:tentative="1">
+      <w:start w:val="1"/>
+      <w:numFmt w:val="decimal"/>
+      <w:lvlText w:val="%4."/>
+      <w:lvlJc w:val="left"/>
+      <w:pPr>
+        <w:ind w:left="2520" w:hanging="360"/>
+      </w:pPr>
+    </w:lvl>
+    <w:lvl w:ilvl="4" w:tplc="08090019" w:tentative="1">
+      <w:start w:val="1"/>
+      <w:numFmt w:val="lowerLetter"/>
+      <w:lvlText w:val="%5."/>
+      <w:lvlJc w:val="left"/>
+      <w:pPr>
+        <w:ind w:left="3240" w:hanging="360"/>
+      </w:pPr>
+    </w:lvl>
+    <w:lvl w:ilvl="5" w:tplc="0809001B" w:tentative="1">
+      <w:start w:val="1"/>
+      <w:numFmt w:val="lowerRoman"/>
+      <w:lvlText w:val="%6."/>
+      <w:lvlJc w:val="right"/>
+      <w:pPr>
+        <w:ind w:left="3960" w:hanging="180"/>
+      </w:pPr>
+    </w:lvl>
+    <w:lvl w:ilvl="6" w:tplc="0809000F" w:tentative="1">
+      <w:start w:val="1"/>
+      <w:numFmt w:val="decimal"/>
+      <w:lvlText w:val="%7."/>
+      <w:lvlJc w:val="left"/>
+      <w:pPr>
+        <w:ind w:left="4680" w:hanging="360"/>
+      </w:pPr>
+    </w:lvl>
+    <w:lvl w:ilvl="7" w:tplc="08090019" w:tentative="1">
+      <w:start w:val="1"/>
+      <w:numFmt w:val="lowerLetter"/>
+      <w:lvlText w:val="%8."/>
+      <w:lvlJc w:val="left"/>
+      <w:pPr>
+        <w:ind w:left="5400" w:hanging="360"/>
+      </w:pPr>
+    </w:lvl>
+    <w:lvl w:ilvl="8" w:tplc="0809001B" w:tentative="1">
+      <w:start w:val="1"/>
+      <w:numFmt w:val="lowerRoman"/>
+      <w:lvlText w:val="%9."/>
+      <w:lvlJc w:val="right"/>
+      <w:pPr>
+        <w:ind w:left="6120" w:hanging="180"/>
+      </w:pPr>
+    </w:lvl>
+  </w:abstractNum>
+  <w:abstractNum w:abstractNumId="2" w15:restartNumberingAfterBreak="0">
     <w:nsid w:val="067C0578"/>
     <w:multiLevelType w:val="multilevel"/>
     <w:tmpl w:val="FA74009A"/>
@@ -1280,7 +3998,7 @@
       </w:rPr>
     </w:lvl>
   </w:abstractNum>
-  <w:abstractNum w:abstractNumId="2" w15:restartNumberingAfterBreak="0">
+  <w:abstractNum w:abstractNumId="3" w15:restartNumberingAfterBreak="0">
     <w:nsid w:val="06A16C0E"/>
     <w:multiLevelType w:val="multilevel"/>
     <w:tmpl w:val="38428C5C"/>
@@ -1393,7 +4111,148 @@
       </w:rPr>
     </w:lvl>
   </w:abstractNum>
-  <w:abstractNum w:abstractNumId="3" w15:restartNumberingAfterBreak="0">
+  <w:abstractNum w:abstractNumId="4" w15:restartNumberingAfterBreak="0">
+    <w:nsid w:val="07AE4577"/>
+    <w:multiLevelType w:val="multilevel"/>
+    <w:tmpl w:val="5FD4DB16"/>
+    <w:lvl w:ilvl="0">
+      <w:start w:val="1"/>
+      <w:numFmt w:val="decimal"/>
+      <w:pStyle w:val="Heading5"/>
+      <w:lvlText w:val="%1."/>
+      <w:lvlJc w:val="left"/>
+      <w:pPr>
+        <w:ind w:left="717" w:hanging="360"/>
+      </w:pPr>
+      <w:rPr>
+        <w:rFonts w:hint="default"/>
+        <w:sz w:val="24"/>
+        <w:szCs w:val="36"/>
+      </w:rPr>
+    </w:lvl>
+    <w:lvl w:ilvl="1">
+      <w:start w:val="1"/>
+      <w:numFmt w:val="bullet"/>
+      <w:lvlText w:val="o"/>
+      <w:lvlJc w:val="left"/>
+      <w:pPr>
+        <w:tabs>
+          <w:tab w:val="num" w:pos="1437"/>
+        </w:tabs>
+        <w:ind w:left="1437" w:hanging="360"/>
+      </w:pPr>
+      <w:rPr>
+        <w:rFonts w:ascii="Courier New" w:hAnsi="Courier New" w:hint="default"/>
+        <w:sz w:val="20"/>
+      </w:rPr>
+    </w:lvl>
+    <w:lvl w:ilvl="2">
+      <w:start w:val="1"/>
+      <w:numFmt w:val="decimal"/>
+      <w:lvlText w:val="%3."/>
+      <w:lvlJc w:val="left"/>
+      <w:pPr>
+        <w:ind w:left="2157" w:hanging="360"/>
+      </w:pPr>
+    </w:lvl>
+    <w:lvl w:ilvl="3" w:tentative="1">
+      <w:start w:val="1"/>
+      <w:numFmt w:val="bullet"/>
+      <w:lvlText w:val=""/>
+      <w:lvlJc w:val="left"/>
+      <w:pPr>
+        <w:tabs>
+          <w:tab w:val="num" w:pos="2877"/>
+        </w:tabs>
+        <w:ind w:left="2877" w:hanging="360"/>
+      </w:pPr>
+      <w:rPr>
+        <w:rFonts w:ascii="Wingdings" w:hAnsi="Wingdings" w:hint="default"/>
+        <w:sz w:val="20"/>
+      </w:rPr>
+    </w:lvl>
+    <w:lvl w:ilvl="4" w:tentative="1">
+      <w:start w:val="1"/>
+      <w:numFmt w:val="bullet"/>
+      <w:lvlText w:val=""/>
+      <w:lvlJc w:val="left"/>
+      <w:pPr>
+        <w:tabs>
+          <w:tab w:val="num" w:pos="3597"/>
+        </w:tabs>
+        <w:ind w:left="3597" w:hanging="360"/>
+      </w:pPr>
+      <w:rPr>
+        <w:rFonts w:ascii="Wingdings" w:hAnsi="Wingdings" w:hint="default"/>
+        <w:sz w:val="20"/>
+      </w:rPr>
+    </w:lvl>
+    <w:lvl w:ilvl="5" w:tentative="1">
+      <w:start w:val="1"/>
+      <w:numFmt w:val="bullet"/>
+      <w:lvlText w:val=""/>
+      <w:lvlJc w:val="left"/>
+      <w:pPr>
+        <w:tabs>
+          <w:tab w:val="num" w:pos="4317"/>
+        </w:tabs>
+        <w:ind w:left="4317" w:hanging="360"/>
+      </w:pPr>
+      <w:rPr>
+        <w:rFonts w:ascii="Wingdings" w:hAnsi="Wingdings" w:hint="default"/>
+        <w:sz w:val="20"/>
+      </w:rPr>
+    </w:lvl>
+    <w:lvl w:ilvl="6" w:tentative="1">
+      <w:start w:val="1"/>
+      <w:numFmt w:val="bullet"/>
+      <w:lvlText w:val=""/>
+      <w:lvlJc w:val="left"/>
+      <w:pPr>
+        <w:tabs>
+          <w:tab w:val="num" w:pos="5037"/>
+        </w:tabs>
+        <w:ind w:left="5037" w:hanging="360"/>
+      </w:pPr>
+      <w:rPr>
+        <w:rFonts w:ascii="Wingdings" w:hAnsi="Wingdings" w:hint="default"/>
+        <w:sz w:val="20"/>
+      </w:rPr>
+    </w:lvl>
+    <w:lvl w:ilvl="7" w:tentative="1">
+      <w:start w:val="1"/>
+      <w:numFmt w:val="bullet"/>
+      <w:lvlText w:val=""/>
+      <w:lvlJc w:val="left"/>
+      <w:pPr>
+        <w:tabs>
+          <w:tab w:val="num" w:pos="5757"/>
+        </w:tabs>
+        <w:ind w:left="5757" w:hanging="360"/>
+      </w:pPr>
+      <w:rPr>
+        <w:rFonts w:ascii="Wingdings" w:hAnsi="Wingdings" w:hint="default"/>
+        <w:sz w:val="20"/>
+      </w:rPr>
+    </w:lvl>
+    <w:lvl w:ilvl="8" w:tentative="1">
+      <w:start w:val="1"/>
+      <w:numFmt w:val="bullet"/>
+      <w:lvlText w:val=""/>
+      <w:lvlJc w:val="left"/>
+      <w:pPr>
+        <w:tabs>
+          <w:tab w:val="num" w:pos="6477"/>
+        </w:tabs>
+        <w:ind w:left="6477" w:hanging="360"/>
+      </w:pPr>
+      <w:rPr>
+        <w:rFonts w:ascii="Wingdings" w:hAnsi="Wingdings" w:hint="default"/>
+        <w:sz w:val="20"/>
+      </w:rPr>
+    </w:lvl>
+  </w:abstractNum>
+  <w:abstractNum w:abstractNumId="5" w15:restartNumberingAfterBreak="0">
     <w:nsid w:val="09B51506"/>
     <w:multiLevelType w:val="hybridMultilevel"/>
     <w:tmpl w:val="2020B95C"/>
@@ -1482,7 +4341,233 @@
       </w:pPr>
     </w:lvl>
   </w:abstractNum>
-  <w:abstractNum w:abstractNumId="4" w15:restartNumberingAfterBreak="0">
+  <w:abstractNum w:abstractNumId="6" w15:restartNumberingAfterBreak="0">
+    <w:nsid w:val="16D51C99"/>
+    <w:multiLevelType w:val="hybridMultilevel"/>
+    <w:tmpl w:val="9418D0F6"/>
+    <w:lvl w:ilvl="0" w:tplc="08090001">
+      <w:start w:val="1"/>
+      <w:numFmt w:val="bullet"/>
+      <w:lvlText w:val=""/>
+      <w:lvlJc w:val="left"/>
+      <w:pPr>
+        <w:ind w:left="360" w:hanging="360"/>
+      </w:pPr>
+      <w:rPr>
+        <w:rFonts w:ascii="Symbol" w:hAnsi="Symbol" w:hint="default"/>
+      </w:rPr>
+    </w:lvl>
+    <w:lvl w:ilvl="1" w:tplc="08090003" w:tentative="1">
+      <w:start w:val="1"/>
+      <w:numFmt w:val="bullet"/>
+      <w:lvlText w:val="o"/>
+      <w:lvlJc w:val="left"/>
+      <w:pPr>
+        <w:ind w:left="1080" w:hanging="360"/>
+      </w:pPr>
+      <w:rPr>
+        <w:rFonts w:ascii="Courier New" w:hAnsi="Courier New" w:hint="default"/>
+      </w:rPr>
+    </w:lvl>
+    <w:lvl w:ilvl="2" w:tplc="08090005" w:tentative="1">
+      <w:start w:val="1"/>
+      <w:numFmt w:val="bullet"/>
+      <w:lvlText w:val=""/>
+      <w:lvlJc w:val="left"/>
+      <w:pPr>
+        <w:ind w:left="1800" w:hanging="360"/>
+      </w:pPr>
+      <w:rPr>
+        <w:rFonts w:ascii="Wingdings" w:hAnsi="Wingdings" w:hint="default"/>
+      </w:rPr>
+    </w:lvl>
+    <w:lvl w:ilvl="3" w:tplc="08090001" w:tentative="1">
+      <w:start w:val="1"/>
+      <w:numFmt w:val="bullet"/>
+      <w:lvlText w:val=""/>
+      <w:lvlJc w:val="left"/>
+      <w:pPr>
+        <w:ind w:left="2520" w:hanging="360"/>
+      </w:pPr>
+      <w:rPr>
+        <w:rFonts w:ascii="Symbol" w:hAnsi="Symbol" w:hint="default"/>
+      </w:rPr>
+    </w:lvl>
+    <w:lvl w:ilvl="4" w:tplc="08090003" w:tentative="1">
+      <w:start w:val="1"/>
+      <w:numFmt w:val="bullet"/>
+      <w:lvlText w:val="o"/>
+      <w:lvlJc w:val="left"/>
+      <w:pPr>
+        <w:ind w:left="3240" w:hanging="360"/>
+      </w:pPr>
+      <w:rPr>
+        <w:rFonts w:ascii="Courier New" w:hAnsi="Courier New" w:hint="default"/>
+      </w:rPr>
+    </w:lvl>
+    <w:lvl w:ilvl="5" w:tplc="08090005" w:tentative="1">
+      <w:start w:val="1"/>
+      <w:numFmt w:val="bullet"/>
+      <w:lvlText w:val=""/>
+      <w:lvlJc w:val="left"/>
+      <w:pPr>
+        <w:ind w:left="3960" w:hanging="360"/>
+      </w:pPr>
+      <w:rPr>
+        <w:rFonts w:ascii="Wingdings" w:hAnsi="Wingdings" w:hint="default"/>
+      </w:rPr>
+    </w:lvl>
+    <w:lvl w:ilvl="6" w:tplc="08090001" w:tentative="1">
+      <w:start w:val="1"/>
+      <w:numFmt w:val="bullet"/>
+      <w:lvlText w:val=""/>
+      <w:lvlJc w:val="left"/>
+      <w:pPr>
+        <w:ind w:left="4680" w:hanging="360"/>
+      </w:pPr>
+      <w:rPr>
+        <w:rFonts w:ascii="Symbol" w:hAnsi="Symbol" w:hint="default"/>
+      </w:rPr>
+    </w:lvl>
+    <w:lvl w:ilvl="7" w:tplc="08090003" w:tentative="1">
+      <w:start w:val="1"/>
+      <w:numFmt w:val="bullet"/>
+      <w:lvlText w:val="o"/>
+      <w:lvlJc w:val="left"/>
+      <w:pPr>
+        <w:ind w:left="5400" w:hanging="360"/>
+      </w:pPr>
+      <w:rPr>
+        <w:rFonts w:ascii="Courier New" w:hAnsi="Courier New" w:hint="default"/>
+      </w:rPr>
+    </w:lvl>
+    <w:lvl w:ilvl="8" w:tplc="08090005" w:tentative="1">
+      <w:start w:val="1"/>
+      <w:numFmt w:val="bullet"/>
+      <w:lvlText w:val=""/>
+      <w:lvlJc w:val="left"/>
+      <w:pPr>
+        <w:ind w:left="6120" w:hanging="360"/>
+      </w:pPr>
+      <w:rPr>
+        <w:rFonts w:ascii="Wingdings" w:hAnsi="Wingdings" w:hint="default"/>
+      </w:rPr>
+    </w:lvl>
+  </w:abstractNum>
+  <w:abstractNum w:abstractNumId="7" w15:restartNumberingAfterBreak="0">
+    <w:nsid w:val="1B577F5C"/>
+    <w:multiLevelType w:val="hybridMultilevel"/>
+    <w:tmpl w:val="93F83D36"/>
+    <w:lvl w:ilvl="0" w:tplc="08090001">
+      <w:start w:val="1"/>
+      <w:numFmt w:val="bullet"/>
+      <w:lvlText w:val=""/>
+      <w:lvlJc w:val="left"/>
+      <w:pPr>
+        <w:ind w:left="360" w:hanging="360"/>
+      </w:pPr>
+      <w:rPr>
+        <w:rFonts w:ascii="Symbol" w:hAnsi="Symbol" w:hint="default"/>
+      </w:rPr>
+    </w:lvl>
+    <w:lvl w:ilvl="1" w:tplc="08090003" w:tentative="1">
+      <w:start w:val="1"/>
+      <w:numFmt w:val="bullet"/>
+      <w:lvlText w:val="o"/>
+      <w:lvlJc w:val="left"/>
+      <w:pPr>
+        <w:ind w:left="1080" w:hanging="360"/>
+      </w:pPr>
+      <w:rPr>
+        <w:rFonts w:ascii="Courier New" w:hAnsi="Courier New" w:hint="default"/>
+      </w:rPr>
+    </w:lvl>
+    <w:lvl w:ilvl="2" w:tplc="08090005" w:tentative="1">
+      <w:start w:val="1"/>
+      <w:numFmt w:val="bullet"/>
+      <w:lvlText w:val=""/>
+      <w:lvlJc w:val="left"/>
+      <w:pPr>
+        <w:ind w:left="1800" w:hanging="360"/>
+      </w:pPr>
+      <w:rPr>
+        <w:rFonts w:ascii="Wingdings" w:hAnsi="Wingdings" w:hint="default"/>
+      </w:rPr>
+    </w:lvl>
+    <w:lvl w:ilvl="3" w:tplc="08090001" w:tentative="1">
+      <w:start w:val="1"/>
+      <w:numFmt w:val="bullet"/>
+      <w:lvlText w:val=""/>
+      <w:lvlJc w:val="left"/>
+      <w:pPr>
+        <w:ind w:left="2520" w:hanging="360"/>
+      </w:pPr>
+      <w:rPr>
+        <w:rFonts w:ascii="Symbol" w:hAnsi="Symbol" w:hint="default"/>
+      </w:rPr>
+    </w:lvl>
+    <w:lvl w:ilvl="4" w:tplc="08090003" w:tentative="1">
+      <w:start w:val="1"/>
+      <w:numFmt w:val="bullet"/>
+      <w:lvlText w:val="o"/>
+      <w:lvlJc w:val="left"/>
+      <w:pPr>
+        <w:ind w:left="3240" w:hanging="360"/>
+      </w:pPr>
+      <w:rPr>
+        <w:rFonts w:ascii="Courier New" w:hAnsi="Courier New" w:hint="default"/>
+      </w:rPr>
+    </w:lvl>
+    <w:lvl w:ilvl="5" w:tplc="08090005" w:tentative="1">
+      <w:start w:val="1"/>
+      <w:numFmt w:val="bullet"/>
+      <w:lvlText w:val=""/>
+      <w:lvlJc w:val="left"/>
+      <w:pPr>
+        <w:ind w:left="3960" w:hanging="360"/>
+      </w:pPr>
+      <w:rPr>
+        <w:rFonts w:ascii="Wingdings" w:hAnsi="Wingdings" w:hint="default"/>
+      </w:rPr>
+    </w:lvl>
+    <w:lvl w:ilvl="6" w:tplc="08090001" w:tentative="1">
+      <w:start w:val="1"/>
+      <w:numFmt w:val="bullet"/>
+      <w:lvlText w:val=""/>
+      <w:lvlJc w:val="left"/>
+      <w:pPr>
+        <w:ind w:left="4680" w:hanging="360"/>
+      </w:pPr>
+      <w:rPr>
+        <w:rFonts w:ascii="Symbol" w:hAnsi="Symbol" w:hint="default"/>
+      </w:rPr>
+    </w:lvl>
+    <w:lvl w:ilvl="7" w:tplc="08090003" w:tentative="1">
+      <w:start w:val="1"/>
+      <w:numFmt w:val="bullet"/>
+      <w:lvlText w:val="o"/>
+      <w:lvlJc w:val="left"/>
+      <w:pPr>
+        <w:ind w:left="5400" w:hanging="360"/>
+      </w:pPr>
+      <w:rPr>
+        <w:rFonts w:ascii="Courier New" w:hAnsi="Courier New" w:hint="default"/>
+      </w:rPr>
+    </w:lvl>
+    <w:lvl w:ilvl="8" w:tplc="08090005" w:tentative="1">
+      <w:start w:val="1"/>
+      <w:numFmt w:val="bullet"/>
+      <w:lvlText w:val=""/>
+      <w:lvlJc w:val="left"/>
+      <w:pPr>
+        <w:ind w:left="6120" w:hanging="360"/>
+      </w:pPr>
+      <w:rPr>
+        <w:rFonts w:ascii="Wingdings" w:hAnsi="Wingdings" w:hint="default"/>
+      </w:rPr>
+    </w:lvl>
+  </w:abstractNum>
+  <w:abstractNum w:abstractNumId="8" w15:restartNumberingAfterBreak="0">
     <w:nsid w:val="1D724596"/>
     <w:multiLevelType w:val="multilevel"/>
     <w:tmpl w:val="86226B00"/>
@@ -1595,7 +4680,7 @@
       </w:rPr>
     </w:lvl>
   </w:abstractNum>
-  <w:abstractNum w:abstractNumId="5" w15:restartNumberingAfterBreak="0">
+  <w:abstractNum w:abstractNumId="9" w15:restartNumberingAfterBreak="0">
     <w:nsid w:val="23AA63A7"/>
     <w:multiLevelType w:val="multilevel"/>
     <w:tmpl w:val="A4CC8F68"/>
@@ -1744,7 +4829,7 @@
       </w:rPr>
     </w:lvl>
   </w:abstractNum>
-  <w:abstractNum w:abstractNumId="6" w15:restartNumberingAfterBreak="0">
+  <w:abstractNum w:abstractNumId="10" w15:restartNumberingAfterBreak="0">
     <w:nsid w:val="23F0580C"/>
     <w:multiLevelType w:val="multilevel"/>
     <w:tmpl w:val="174404EE"/>
@@ -1893,7 +4978,7 @@
       </w:rPr>
     </w:lvl>
   </w:abstractNum>
-  <w:abstractNum w:abstractNumId="7" w15:restartNumberingAfterBreak="0">
+  <w:abstractNum w:abstractNumId="11" w15:restartNumberingAfterBreak="0">
     <w:nsid w:val="2A886385"/>
     <w:multiLevelType w:val="hybridMultilevel"/>
     <w:tmpl w:val="455AE55E"/>
@@ -2007,7 +5092,120 @@
       </w:rPr>
     </w:lvl>
   </w:abstractNum>
-  <w:abstractNum w:abstractNumId="8" w15:restartNumberingAfterBreak="0">
+  <w:abstractNum w:abstractNumId="12" w15:restartNumberingAfterBreak="0">
+    <w:nsid w:val="2ACD27D6"/>
+    <w:multiLevelType w:val="hybridMultilevel"/>
+    <w:tmpl w:val="D81E8226"/>
+    <w:lvl w:ilvl="0" w:tplc="08090001">
+      <w:start w:val="1"/>
+      <w:numFmt w:val="bullet"/>
+      <w:lvlText w:val=""/>
+      <w:lvlJc w:val="left"/>
+      <w:pPr>
+        <w:ind w:left="360" w:hanging="360"/>
+      </w:pPr>
+      <w:rPr>
+        <w:rFonts w:ascii="Symbol" w:hAnsi="Symbol" w:hint="default"/>
+      </w:rPr>
+    </w:lvl>
+    <w:lvl w:ilvl="1" w:tplc="08090003" w:tentative="1">
+      <w:start w:val="1"/>
+      <w:numFmt w:val="bullet"/>
+      <w:lvlText w:val="o"/>
+      <w:lvlJc w:val="left"/>
+      <w:pPr>
+        <w:ind w:left="1080" w:hanging="360"/>
+      </w:pPr>
+      <w:rPr>
+        <w:rFonts w:ascii="Courier New" w:hAnsi="Courier New" w:hint="default"/>
+      </w:rPr>
+    </w:lvl>
+    <w:lvl w:ilvl="2" w:tplc="08090005" w:tentative="1">
+      <w:start w:val="1"/>
+      <w:numFmt w:val="bullet"/>
+      <w:lvlText w:val=""/>
+      <w:lvlJc w:val="left"/>
+      <w:pPr>
+        <w:ind w:left="1800" w:hanging="360"/>
+      </w:pPr>
+      <w:rPr>
+        <w:rFonts w:ascii="Wingdings" w:hAnsi="Wingdings" w:hint="default"/>
+      </w:rPr>
+    </w:lvl>
+    <w:lvl w:ilvl="3" w:tplc="08090001" w:tentative="1">
+      <w:start w:val="1"/>
+      <w:numFmt w:val="bullet"/>
+      <w:lvlText w:val=""/>
+      <w:lvlJc w:val="left"/>
+      <w:pPr>
+        <w:ind w:left="2520" w:hanging="360"/>
+      </w:pPr>
+      <w:rPr>
+        <w:rFonts w:ascii="Symbol" w:hAnsi="Symbol" w:hint="default"/>
+      </w:rPr>
+    </w:lvl>
+    <w:lvl w:ilvl="4" w:tplc="08090003" w:tentative="1">
+      <w:start w:val="1"/>
+      <w:numFmt w:val="bullet"/>
+      <w:lvlText w:val="o"/>
+      <w:lvlJc w:val="left"/>
+      <w:pPr>
+        <w:ind w:left="3240" w:hanging="360"/>
+      </w:pPr>
+      <w:rPr>
+        <w:rFonts w:ascii="Courier New" w:hAnsi="Courier New" w:hint="default"/>
+      </w:rPr>
+    </w:lvl>
+    <w:lvl w:ilvl="5" w:tplc="08090005" w:tentative="1">
+      <w:start w:val="1"/>
+      <w:numFmt w:val="bullet"/>
+      <w:lvlText w:val=""/>
+      <w:lvlJc w:val="left"/>
+      <w:pPr>
+        <w:ind w:left="3960" w:hanging="360"/>
+      </w:pPr>
+      <w:rPr>
+        <w:rFonts w:ascii="Wingdings" w:hAnsi="Wingdings" w:hint="default"/>
+      </w:rPr>
+    </w:lvl>
+    <w:lvl w:ilvl="6" w:tplc="08090001" w:tentative="1">
+      <w:start w:val="1"/>
+      <w:numFmt w:val="bullet"/>
+      <w:lvlText w:val=""/>
+      <w:lvlJc w:val="left"/>
+      <w:pPr>
+        <w:ind w:left="4680" w:hanging="360"/>
+      </w:pPr>
+      <w:rPr>
+        <w:rFonts w:ascii="Symbol" w:hAnsi="Symbol" w:hint="default"/>
+      </w:rPr>
+    </w:lvl>
+    <w:lvl w:ilvl="7" w:tplc="08090003" w:tentative="1">
+      <w:start w:val="1"/>
+      <w:numFmt w:val="bullet"/>
+      <w:lvlText w:val="o"/>
+      <w:lvlJc w:val="left"/>
+      <w:pPr>
+        <w:ind w:left="5400" w:hanging="360"/>
+      </w:pPr>
+      <w:rPr>
+        <w:rFonts w:ascii="Courier New" w:hAnsi="Courier New" w:hint="default"/>
+      </w:rPr>
+    </w:lvl>
+    <w:lvl w:ilvl="8" w:tplc="08090005" w:tentative="1">
+      <w:start w:val="1"/>
+      <w:numFmt w:val="bullet"/>
+      <w:lvlText w:val=""/>
+      <w:lvlJc w:val="left"/>
+      <w:pPr>
+        <w:ind w:left="6120" w:hanging="360"/>
+      </w:pPr>
+      <w:rPr>
+        <w:rFonts w:ascii="Wingdings" w:hAnsi="Wingdings" w:hint="default"/>
+      </w:rPr>
+    </w:lvl>
+  </w:abstractNum>
+  <w:abstractNum w:abstractNumId="13" w15:restartNumberingAfterBreak="0">
     <w:nsid w:val="2C265B51"/>
     <w:multiLevelType w:val="hybridMultilevel"/>
     <w:tmpl w:val="D528D6D4"/>
@@ -2096,7 +5294,7 @@
       </w:pPr>
     </w:lvl>
   </w:abstractNum>
-  <w:abstractNum w:abstractNumId="9" w15:restartNumberingAfterBreak="0">
+  <w:abstractNum w:abstractNumId="14" w15:restartNumberingAfterBreak="0">
     <w:nsid w:val="32C3292D"/>
     <w:multiLevelType w:val="hybridMultilevel"/>
     <w:tmpl w:val="ACF01E56"/>
@@ -2185,7 +5383,120 @@
       </w:pPr>
     </w:lvl>
   </w:abstractNum>
-  <w:abstractNum w:abstractNumId="10" w15:restartNumberingAfterBreak="0">
+  <w:abstractNum w:abstractNumId="15" w15:restartNumberingAfterBreak="0">
+    <w:nsid w:val="34926FF9"/>
+    <w:multiLevelType w:val="hybridMultilevel"/>
+    <w:tmpl w:val="FEE2F2D2"/>
+    <w:lvl w:ilvl="0" w:tplc="08090001">
+      <w:start w:val="1"/>
+      <w:numFmt w:val="bullet"/>
+      <w:lvlText w:val=""/>
+      <w:lvlJc w:val="left"/>
+      <w:pPr>
+        <w:ind w:left="360" w:hanging="360"/>
+      </w:pPr>
+      <w:rPr>
+        <w:rFonts w:ascii="Symbol" w:hAnsi="Symbol" w:hint="default"/>
+      </w:rPr>
+    </w:lvl>
+    <w:lvl w:ilvl="1" w:tplc="08090003" w:tentative="1">
+      <w:start w:val="1"/>
+      <w:numFmt w:val="bullet"/>
+      <w:lvlText w:val="o"/>
+      <w:lvlJc w:val="left"/>
+      <w:pPr>
+        <w:ind w:left="1080" w:hanging="360"/>
+      </w:pPr>
+      <w:rPr>
+        <w:rFonts w:ascii="Courier New" w:hAnsi="Courier New" w:hint="default"/>
+      </w:rPr>
+    </w:lvl>
+    <w:lvl w:ilvl="2" w:tplc="08090005" w:tentative="1">
+      <w:start w:val="1"/>
+      <w:numFmt w:val="bullet"/>
+      <w:lvlText w:val=""/>
+      <w:lvlJc w:val="left"/>
+      <w:pPr>
+        <w:ind w:left="1800" w:hanging="360"/>
+      </w:pPr>
+      <w:rPr>
+        <w:rFonts w:ascii="Wingdings" w:hAnsi="Wingdings" w:hint="default"/>
+      </w:rPr>
+    </w:lvl>
+    <w:lvl w:ilvl="3" w:tplc="08090001" w:tentative="1">
+      <w:start w:val="1"/>
+      <w:numFmt w:val="bullet"/>
+      <w:lvlText w:val=""/>
+      <w:lvlJc w:val="left"/>
+      <w:pPr>
+        <w:ind w:left="2520" w:hanging="360"/>
+      </w:pPr>
+      <w:rPr>
+        <w:rFonts w:ascii="Symbol" w:hAnsi="Symbol" w:hint="default"/>
+      </w:rPr>
+    </w:lvl>
+    <w:lvl w:ilvl="4" w:tplc="08090003" w:tentative="1">
+      <w:start w:val="1"/>
+      <w:numFmt w:val="bullet"/>
+      <w:lvlText w:val="o"/>
+      <w:lvlJc w:val="left"/>
+      <w:pPr>
+        <w:ind w:left="3240" w:hanging="360"/>
+      </w:pPr>
+      <w:rPr>
+        <w:rFonts w:ascii="Courier New" w:hAnsi="Courier New" w:hint="default"/>
+      </w:rPr>
+    </w:lvl>
+    <w:lvl w:ilvl="5" w:tplc="08090005" w:tentative="1">
+      <w:start w:val="1"/>
+      <w:numFmt w:val="bullet"/>
+      <w:lvlText w:val=""/>
+      <w:lvlJc w:val="left"/>
+      <w:pPr>
+        <w:ind w:left="3960" w:hanging="360"/>
+      </w:pPr>
+      <w:rPr>
+        <w:rFonts w:ascii="Wingdings" w:hAnsi="Wingdings" w:hint="default"/>
+      </w:rPr>
+    </w:lvl>
+    <w:lvl w:ilvl="6" w:tplc="08090001" w:tentative="1">
+      <w:start w:val="1"/>
+      <w:numFmt w:val="bullet"/>
+      <w:lvlText w:val=""/>
+      <w:lvlJc w:val="left"/>
+      <w:pPr>
+        <w:ind w:left="4680" w:hanging="360"/>
+      </w:pPr>
+      <w:rPr>
+        <w:rFonts w:ascii="Symbol" w:hAnsi="Symbol" w:hint="default"/>
+      </w:rPr>
+    </w:lvl>
+    <w:lvl w:ilvl="7" w:tplc="08090003" w:tentative="1">
+      <w:start w:val="1"/>
+      <w:numFmt w:val="bullet"/>
+      <w:lvlText w:val="o"/>
+      <w:lvlJc w:val="left"/>
+      <w:pPr>
+        <w:ind w:left="5400" w:hanging="360"/>
+      </w:pPr>
+      <w:rPr>
+        <w:rFonts w:ascii="Courier New" w:hAnsi="Courier New" w:hint="default"/>
+      </w:rPr>
+    </w:lvl>
+    <w:lvl w:ilvl="8" w:tplc="08090005" w:tentative="1">
+      <w:start w:val="1"/>
+      <w:numFmt w:val="bullet"/>
+      <w:lvlText w:val=""/>
+      <w:lvlJc w:val="left"/>
+      <w:pPr>
+        <w:ind w:left="6120" w:hanging="360"/>
+      </w:pPr>
+      <w:rPr>
+        <w:rFonts w:ascii="Wingdings" w:hAnsi="Wingdings" w:hint="default"/>
+      </w:rPr>
+    </w:lvl>
+  </w:abstractNum>
+  <w:abstractNum w:abstractNumId="16" w15:restartNumberingAfterBreak="0">
     <w:nsid w:val="356104B6"/>
     <w:multiLevelType w:val="hybridMultilevel"/>
     <w:tmpl w:val="F7AE580E"/>
@@ -2299,7 +5610,7 @@
       </w:rPr>
     </w:lvl>
   </w:abstractNum>
-  <w:abstractNum w:abstractNumId="11" w15:restartNumberingAfterBreak="0">
+  <w:abstractNum w:abstractNumId="17" w15:restartNumberingAfterBreak="0">
     <w:nsid w:val="369F26C1"/>
     <w:multiLevelType w:val="hybridMultilevel"/>
     <w:tmpl w:val="DF601F20"/>
@@ -2388,7 +5699,7 @@
       </w:pPr>
     </w:lvl>
   </w:abstractNum>
-  <w:abstractNum w:abstractNumId="12" w15:restartNumberingAfterBreak="0">
+  <w:abstractNum w:abstractNumId="18" w15:restartNumberingAfterBreak="0">
     <w:nsid w:val="38106EFB"/>
     <w:multiLevelType w:val="hybridMultilevel"/>
     <w:tmpl w:val="BBB6C246"/>
@@ -2502,7 +5813,7 @@
       </w:rPr>
     </w:lvl>
   </w:abstractNum>
-  <w:abstractNum w:abstractNumId="13" w15:restartNumberingAfterBreak="0">
+  <w:abstractNum w:abstractNumId="19" w15:restartNumberingAfterBreak="0">
     <w:nsid w:val="3A481507"/>
     <w:multiLevelType w:val="hybridMultilevel"/>
     <w:tmpl w:val="12709E4A"/>
@@ -2615,7 +5926,149 @@
       </w:rPr>
     </w:lvl>
   </w:abstractNum>
-  <w:abstractNum w:abstractNumId="14" w15:restartNumberingAfterBreak="0">
+  <w:abstractNum w:abstractNumId="20" w15:restartNumberingAfterBreak="0">
+    <w:nsid w:val="3ABF7B3F"/>
+    <w:multiLevelType w:val="multilevel"/>
+    <w:tmpl w:val="C0480E18"/>
+    <w:lvl w:ilvl="0">
+      <w:start w:val="1"/>
+      <w:numFmt w:val="bullet"/>
+      <w:lvlText w:val=""/>
+      <w:lvlJc w:val="left"/>
+      <w:pPr>
+        <w:tabs>
+          <w:tab w:val="num" w:pos="720"/>
+        </w:tabs>
+        <w:ind w:left="720" w:hanging="360"/>
+      </w:pPr>
+      <w:rPr>
+        <w:rFonts w:ascii="Symbol" w:hAnsi="Symbol" w:hint="default"/>
+        <w:sz w:val="20"/>
+      </w:rPr>
+    </w:lvl>
+    <w:lvl w:ilvl="1">
+      <w:start w:val="1"/>
+      <w:numFmt w:val="bullet"/>
+      <w:lvlText w:val="o"/>
+      <w:lvlJc w:val="left"/>
+      <w:pPr>
+        <w:tabs>
+          <w:tab w:val="num" w:pos="1440"/>
+        </w:tabs>
+        <w:ind w:left="1440" w:hanging="360"/>
+      </w:pPr>
+      <w:rPr>
+        <w:rFonts w:ascii="Courier New" w:hAnsi="Courier New" w:hint="default"/>
+        <w:sz w:val="20"/>
+      </w:rPr>
+    </w:lvl>
+    <w:lvl w:ilvl="2">
+      <w:start w:val="1"/>
+      <w:numFmt w:val="decimal"/>
+      <w:lvlText w:val="%3."/>
+      <w:lvlJc w:val="left"/>
+      <w:pPr>
+        <w:ind w:left="2160" w:hanging="360"/>
+      </w:pPr>
+    </w:lvl>
+    <w:lvl w:ilvl="3" w:tentative="1">
+      <w:start w:val="1"/>
+      <w:numFmt w:val="bullet"/>
+      <w:lvlText w:val=""/>
+      <w:lvlJc w:val="left"/>
+      <w:pPr>
+        <w:tabs>
+          <w:tab w:val="num" w:pos="2880"/>
+        </w:tabs>
+        <w:ind w:left="2880" w:hanging="360"/>
+      </w:pPr>
+      <w:rPr>
+        <w:rFonts w:ascii="Wingdings" w:hAnsi="Wingdings" w:hint="default"/>
+        <w:sz w:val="20"/>
+      </w:rPr>
+    </w:lvl>
+    <w:lvl w:ilvl="4" w:tentative="1">
+      <w:start w:val="1"/>
+      <w:numFmt w:val="bullet"/>
+      <w:lvlText w:val=""/>
+      <w:lvlJc w:val="left"/>
+      <w:pPr>
+        <w:tabs>
+          <w:tab w:val="num" w:pos="3600"/>
+        </w:tabs>
+        <w:ind w:left="3600" w:hanging="360"/>
+      </w:pPr>
+      <w:rPr>
+        <w:rFonts w:ascii="Wingdings" w:hAnsi="Wingdings" w:hint="default"/>
+        <w:sz w:val="20"/>
+      </w:rPr>
+    </w:lvl>
+    <w:lvl w:ilvl="5" w:tentative="1">
+      <w:start w:val="1"/>
+      <w:numFmt w:val="bullet"/>
+      <w:lvlText w:val=""/>
+      <w:lvlJc w:val="left"/>
+      <w:pPr>
+        <w:tabs>
+          <w:tab w:val="num" w:pos="4320"/>
+        </w:tabs>
+        <w:ind w:left="4320" w:hanging="360"/>
+      </w:pPr>
+      <w:rPr>
+        <w:rFonts w:ascii="Wingdings" w:hAnsi="Wingdings" w:hint="default"/>
+        <w:sz w:val="20"/>
+      </w:rPr>
+    </w:lvl>
+    <w:lvl w:ilvl="6" w:tentative="1">
+      <w:start w:val="1"/>
+      <w:numFmt w:val="bullet"/>
+      <w:lvlText w:val=""/>
+      <w:lvlJc w:val="left"/>
+      <w:pPr>
+        <w:tabs>
+          <w:tab w:val="num" w:pos="5040"/>
+        </w:tabs>
+        <w:ind w:left="5040" w:hanging="360"/>
+      </w:pPr>
+      <w:rPr>
+        <w:rFonts w:ascii="Wingdings" w:hAnsi="Wingdings" w:hint="default"/>
+        <w:sz w:val="20"/>
+      </w:rPr>
+    </w:lvl>
+    <w:lvl w:ilvl="7" w:tentative="1">
+      <w:start w:val="1"/>
+      <w:numFmt w:val="bullet"/>
+      <w:lvlText w:val=""/>
+      <w:lvlJc w:val="left"/>
+      <w:pPr>
+        <w:tabs>
+          <w:tab w:val="num" w:pos="5760"/>
+        </w:tabs>
+        <w:ind w:left="5760" w:hanging="360"/>
+      </w:pPr>
+      <w:rPr>
+        <w:rFonts w:ascii="Wingdings" w:hAnsi="Wingdings" w:hint="default"/>
+        <w:sz w:val="20"/>
+      </w:rPr>
+    </w:lvl>
+    <w:lvl w:ilvl="8" w:tentative="1">
+      <w:start w:val="1"/>
+      <w:numFmt w:val="bullet"/>
+      <w:lvlText w:val=""/>
+      <w:lvlJc w:val="left"/>
+      <w:pPr>
+        <w:tabs>
+          <w:tab w:val="num" w:pos="6480"/>
+        </w:tabs>
+        <w:ind w:left="6480" w:hanging="360"/>
+      </w:pPr>
+      <w:rPr>
+        <w:rFonts w:ascii="Wingdings" w:hAnsi="Wingdings" w:hint="default"/>
+        <w:sz w:val="20"/>
+      </w:rPr>
+    </w:lvl>
+  </w:abstractNum>
+  <w:abstractNum w:abstractNumId="21" w15:restartNumberingAfterBreak="0">
     <w:nsid w:val="3B491A5C"/>
     <w:multiLevelType w:val="multilevel"/>
     <w:tmpl w:val="A874F3F8"/>
@@ -2732,7 +6185,7 @@
       </w:pPr>
     </w:lvl>
   </w:abstractNum>
-  <w:abstractNum w:abstractNumId="15" w15:restartNumberingAfterBreak="0">
+  <w:abstractNum w:abstractNumId="22" w15:restartNumberingAfterBreak="0">
     <w:nsid w:val="40221435"/>
     <w:multiLevelType w:val="multilevel"/>
     <w:tmpl w:val="F68AB6EC"/>
@@ -2845,7 +6298,7 @@
       </w:rPr>
     </w:lvl>
   </w:abstractNum>
-  <w:abstractNum w:abstractNumId="16" w15:restartNumberingAfterBreak="0">
+  <w:abstractNum w:abstractNumId="23" w15:restartNumberingAfterBreak="0">
     <w:nsid w:val="45D25797"/>
     <w:multiLevelType w:val="multilevel"/>
     <w:tmpl w:val="15E67BC0"/>
@@ -2994,7 +6447,234 @@
       </w:rPr>
     </w:lvl>
   </w:abstractNum>
-  <w:abstractNum w:abstractNumId="17" w15:restartNumberingAfterBreak="0">
+  <w:abstractNum w:abstractNumId="24" w15:restartNumberingAfterBreak="0">
+    <w:nsid w:val="485B113D"/>
+    <w:multiLevelType w:val="multilevel"/>
+    <w:tmpl w:val="E4E48054"/>
+    <w:lvl w:ilvl="0">
+      <w:start w:val="1"/>
+      <w:numFmt w:val="decimal"/>
+      <w:pStyle w:val="Heading1"/>
+      <w:lvlText w:val="%1.0"/>
+      <w:lvlJc w:val="left"/>
+      <w:pPr>
+        <w:ind w:left="600" w:hanging="600"/>
+      </w:pPr>
+      <w:rPr>
+        <w:rFonts w:hint="default"/>
+      </w:rPr>
+    </w:lvl>
+    <w:lvl w:ilvl="1">
+      <w:start w:val="1"/>
+      <w:numFmt w:val="decimal"/>
+      <w:lvlText w:val="%1.%2"/>
+      <w:lvlJc w:val="left"/>
+      <w:pPr>
+        <w:ind w:left="1320" w:hanging="600"/>
+      </w:pPr>
+      <w:rPr>
+        <w:rFonts w:hint="default"/>
+      </w:rPr>
+    </w:lvl>
+    <w:lvl w:ilvl="2">
+      <w:start w:val="1"/>
+      <w:numFmt w:val="decimal"/>
+      <w:lvlText w:val="%1.%2.%3"/>
+      <w:lvlJc w:val="left"/>
+      <w:pPr>
+        <w:ind w:left="2160" w:hanging="720"/>
+      </w:pPr>
+      <w:rPr>
+        <w:rFonts w:hint="default"/>
+      </w:rPr>
+    </w:lvl>
+    <w:lvl w:ilvl="3">
+      <w:start w:val="1"/>
+      <w:numFmt w:val="decimal"/>
+      <w:lvlText w:val="%1.%2.%3.%4"/>
+      <w:lvlJc w:val="left"/>
+      <w:pPr>
+        <w:ind w:left="3240" w:hanging="1080"/>
+      </w:pPr>
+      <w:rPr>
+        <w:rFonts w:hint="default"/>
+      </w:rPr>
+    </w:lvl>
+    <w:lvl w:ilvl="4">
+      <w:start w:val="1"/>
+      <w:numFmt w:val="decimal"/>
+      <w:lvlText w:val="%1.%2.%3.%4.%5"/>
+      <w:lvlJc w:val="left"/>
+      <w:pPr>
+        <w:ind w:left="3960" w:hanging="1080"/>
+      </w:pPr>
+      <w:rPr>
+        <w:rFonts w:hint="default"/>
+      </w:rPr>
+    </w:lvl>
+    <w:lvl w:ilvl="5">
+      <w:start w:val="1"/>
+      <w:numFmt w:val="decimal"/>
+      <w:lvlText w:val="%1.%2.%3.%4.%5.%6"/>
+      <w:lvlJc w:val="left"/>
+      <w:pPr>
+        <w:ind w:left="5040" w:hanging="1440"/>
+      </w:pPr>
+      <w:rPr>
+        <w:rFonts w:hint="default"/>
+      </w:rPr>
+    </w:lvl>
+    <w:lvl w:ilvl="6">
+      <w:start w:val="1"/>
+      <w:numFmt w:val="decimal"/>
+      <w:lvlText w:val="%1.%2.%3.%4.%5.%6.%7"/>
+      <w:lvlJc w:val="left"/>
+      <w:pPr>
+        <w:ind w:left="5760" w:hanging="1440"/>
+      </w:pPr>
+      <w:rPr>
+        <w:rFonts w:hint="default"/>
+      </w:rPr>
+    </w:lvl>
+    <w:lvl w:ilvl="7">
+      <w:start w:val="1"/>
+      <w:numFmt w:val="decimal"/>
+      <w:lvlText w:val="%1.%2.%3.%4.%5.%6.%7.%8"/>
+      <w:lvlJc w:val="left"/>
+      <w:pPr>
+        <w:ind w:left="6840" w:hanging="1800"/>
+      </w:pPr>
+      <w:rPr>
+        <w:rFonts w:hint="default"/>
+      </w:rPr>
+    </w:lvl>
+    <w:lvl w:ilvl="8">
+      <w:start w:val="1"/>
+      <w:numFmt w:val="decimal"/>
+      <w:lvlText w:val="%1.%2.%3.%4.%5.%6.%7.%8.%9"/>
+      <w:lvlJc w:val="left"/>
+      <w:pPr>
+        <w:ind w:left="7560" w:hanging="1800"/>
+      </w:pPr>
+      <w:rPr>
+        <w:rFonts w:hint="default"/>
+      </w:rPr>
+    </w:lvl>
+  </w:abstractNum>
+  <w:abstractNum w:abstractNumId="25" w15:restartNumberingAfterBreak="0">
+    <w:nsid w:val="4F152905"/>
+    <w:multiLevelType w:val="multilevel"/>
+    <w:tmpl w:val="B26EC606"/>
+    <w:lvl w:ilvl="0">
+      <w:start w:val="1"/>
+      <w:numFmt w:val="decimal"/>
+      <w:lvlText w:val="%1.0"/>
+      <w:lvlJc w:val="left"/>
+      <w:pPr>
+        <w:ind w:left="600" w:hanging="600"/>
+      </w:pPr>
+      <w:rPr>
+        <w:rFonts w:hint="default"/>
+      </w:rPr>
+    </w:lvl>
+    <w:lvl w:ilvl="1">
+      <w:start w:val="1"/>
+      <w:numFmt w:val="decimal"/>
+      <w:lvlText w:val="%1.%2"/>
+      <w:lvlJc w:val="left"/>
+      <w:pPr>
+        <w:ind w:left="1320" w:hanging="600"/>
+      </w:pPr>
+      <w:rPr>
+        <w:rFonts w:hint="default"/>
+      </w:rPr>
+    </w:lvl>
+    <w:lvl w:ilvl="2">
+      <w:start w:val="1"/>
+      <w:numFmt w:val="decimal"/>
+      <w:lvlText w:val="%1.%2.%3"/>
+      <w:lvlJc w:val="left"/>
+      <w:pPr>
+        <w:ind w:left="2160" w:hanging="720"/>
+      </w:pPr>
+      <w:rPr>
+        <w:rFonts w:hint="default"/>
+      </w:rPr>
+    </w:lvl>
+    <w:lvl w:ilvl="3">
+      <w:start w:val="1"/>
+      <w:numFmt w:val="decimal"/>
+      <w:lvlText w:val="%1.%2.%3.%4"/>
+      <w:lvlJc w:val="left"/>
+      <w:pPr>
+        <w:ind w:left="3240" w:hanging="1080"/>
+      </w:pPr>
+      <w:rPr>
+        <w:rFonts w:hint="default"/>
+      </w:rPr>
+    </w:lvl>
+    <w:lvl w:ilvl="4">
+      <w:start w:val="1"/>
+      <w:numFmt w:val="decimal"/>
+      <w:lvlText w:val="%1.%2.%3.%4.%5"/>
+      <w:lvlJc w:val="left"/>
+      <w:pPr>
+        <w:ind w:left="3960" w:hanging="1080"/>
+      </w:pPr>
+      <w:rPr>
+        <w:rFonts w:hint="default"/>
+      </w:rPr>
+    </w:lvl>
+    <w:lvl w:ilvl="5">
+      <w:start w:val="1"/>
+      <w:numFmt w:val="decimal"/>
+      <w:lvlText w:val="%1.%2.%3.%4.%5.%6"/>
+      <w:lvlJc w:val="left"/>
+      <w:pPr>
+        <w:ind w:left="5040" w:hanging="1440"/>
+      </w:pPr>
+      <w:rPr>
+        <w:rFonts w:hint="default"/>
+      </w:rPr>
+    </w:lvl>
+    <w:lvl w:ilvl="6">
+      <w:start w:val="1"/>
+      <w:numFmt w:val="decimal"/>
+      <w:lvlText w:val="%1.%2.%3.%4.%5.%6.%7"/>
+      <w:lvlJc w:val="left"/>
+      <w:pPr>
+        <w:ind w:left="5760" w:hanging="1440"/>
+      </w:pPr>
+      <w:rPr>
+        <w:rFonts w:hint="default"/>
+      </w:rPr>
+    </w:lvl>
+    <w:lvl w:ilvl="7">
+      <w:start w:val="1"/>
+      <w:numFmt w:val="decimal"/>
+      <w:lvlText w:val="%1.%2.%3.%4.%5.%6.%7.%8"/>
+      <w:lvlJc w:val="left"/>
+      <w:pPr>
+        <w:ind w:left="6840" w:hanging="1800"/>
+      </w:pPr>
+      <w:rPr>
+        <w:rFonts w:hint="default"/>
+      </w:rPr>
+    </w:lvl>
+    <w:lvl w:ilvl="8">
+      <w:start w:val="1"/>
+      <w:numFmt w:val="decimal"/>
+      <w:lvlText w:val="%1.%2.%3.%4.%5.%6.%7.%8.%9"/>
+      <w:lvlJc w:val="left"/>
+      <w:pPr>
+        <w:ind w:left="7560" w:hanging="1800"/>
+      </w:pPr>
+      <w:rPr>
+        <w:rFonts w:hint="default"/>
+      </w:rPr>
+    </w:lvl>
+  </w:abstractNum>
+  <w:abstractNum w:abstractNumId="26" w15:restartNumberingAfterBreak="0">
     <w:nsid w:val="53551CE9"/>
     <w:multiLevelType w:val="hybridMultilevel"/>
     <w:tmpl w:val="BE72A218"/>
@@ -3083,7 +6763,7 @@
       </w:pPr>
     </w:lvl>
   </w:abstractNum>
-  <w:abstractNum w:abstractNumId="18" w15:restartNumberingAfterBreak="0">
+  <w:abstractNum w:abstractNumId="27" w15:restartNumberingAfterBreak="0">
     <w:nsid w:val="53F10672"/>
     <w:multiLevelType w:val="hybridMultilevel"/>
     <w:tmpl w:val="67D245C4"/>
@@ -3173,7 +6853,7 @@
       </w:pPr>
     </w:lvl>
   </w:abstractNum>
-  <w:abstractNum w:abstractNumId="19" w15:restartNumberingAfterBreak="0">
+  <w:abstractNum w:abstractNumId="28" w15:restartNumberingAfterBreak="0">
     <w:nsid w:val="56390F19"/>
     <w:multiLevelType w:val="hybridMultilevel"/>
     <w:tmpl w:val="E03AB058"/>
@@ -3259,7 +6939,7 @@
       </w:pPr>
     </w:lvl>
   </w:abstractNum>
-  <w:abstractNum w:abstractNumId="20" w15:restartNumberingAfterBreak="0">
+  <w:abstractNum w:abstractNumId="29" w15:restartNumberingAfterBreak="0">
     <w:nsid w:val="588F261B"/>
     <w:multiLevelType w:val="multilevel"/>
     <w:tmpl w:val="17FA2236"/>
@@ -3372,7 +7052,7 @@
       </w:rPr>
     </w:lvl>
   </w:abstractNum>
-  <w:abstractNum w:abstractNumId="21" w15:restartNumberingAfterBreak="0">
+  <w:abstractNum w:abstractNumId="30" w15:restartNumberingAfterBreak="0">
     <w:nsid w:val="5A663355"/>
     <w:multiLevelType w:val="hybridMultilevel"/>
     <w:tmpl w:val="0CF2011E"/>
@@ -3486,7 +7166,7 @@
       </w:rPr>
     </w:lvl>
   </w:abstractNum>
-  <w:abstractNum w:abstractNumId="22" w15:restartNumberingAfterBreak="0">
+  <w:abstractNum w:abstractNumId="31" w15:restartNumberingAfterBreak="0">
     <w:nsid w:val="5B0338E8"/>
     <w:multiLevelType w:val="hybridMultilevel"/>
     <w:tmpl w:val="24B6A9EE"/>
@@ -3600,7 +7280,7 @@
       </w:rPr>
     </w:lvl>
   </w:abstractNum>
-  <w:abstractNum w:abstractNumId="23" w15:restartNumberingAfterBreak="0">
+  <w:abstractNum w:abstractNumId="32" w15:restartNumberingAfterBreak="0">
     <w:nsid w:val="5E855A73"/>
     <w:multiLevelType w:val="hybridMultilevel"/>
     <w:tmpl w:val="E126061E"/>
@@ -3686,7 +7366,7 @@
       </w:pPr>
     </w:lvl>
   </w:abstractNum>
-  <w:abstractNum w:abstractNumId="24" w15:restartNumberingAfterBreak="0">
+  <w:abstractNum w:abstractNumId="33" w15:restartNumberingAfterBreak="0">
     <w:nsid w:val="5F5C13AC"/>
     <w:multiLevelType w:val="multilevel"/>
     <w:tmpl w:val="47D2D46C"/>
@@ -3807,7 +7487,156 @@
       </w:rPr>
     </w:lvl>
   </w:abstractNum>
-  <w:abstractNum w:abstractNumId="25" w15:restartNumberingAfterBreak="0">
+  <w:abstractNum w:abstractNumId="34" w15:restartNumberingAfterBreak="0">
+    <w:nsid w:val="69D7384C"/>
+    <w:multiLevelType w:val="multilevel"/>
+    <w:tmpl w:val="0866A80C"/>
+    <w:lvl w:ilvl="0">
+      <w:start w:val="5"/>
+      <w:numFmt w:val="decimal"/>
+      <w:lvlText w:val="%1.0"/>
+      <w:lvlJc w:val="left"/>
+      <w:pPr>
+        <w:ind w:left="720" w:hanging="720"/>
+      </w:pPr>
+      <w:rPr>
+        <w:rFonts w:eastAsia="Times New Roman" w:cs="Times New Roman" w:hint="default"/>
+        <w:b/>
+        <w:color w:val="0000FF"/>
+        <w:sz w:val="20"/>
+        <w:u w:val="single"/>
+      </w:rPr>
+    </w:lvl>
+    <w:lvl w:ilvl="1">
+      <w:start w:val="1"/>
+      <w:numFmt w:val="decimal"/>
+      <w:lvlText w:val="%1.%2"/>
+      <w:lvlJc w:val="left"/>
+      <w:pPr>
+        <w:ind w:left="1440" w:hanging="720"/>
+      </w:pPr>
+      <w:rPr>
+        <w:rFonts w:eastAsia="Times New Roman" w:cs="Times New Roman" w:hint="default"/>
+        <w:b/>
+        <w:color w:val="0000FF"/>
+        <w:sz w:val="20"/>
+        <w:u w:val="single"/>
+      </w:rPr>
+    </w:lvl>
+    <w:lvl w:ilvl="2">
+      <w:start w:val="1"/>
+      <w:numFmt w:val="decimal"/>
+      <w:lvlText w:val="%1.%2.%3"/>
+      <w:lvlJc w:val="left"/>
+      <w:pPr>
+        <w:ind w:left="2520" w:hanging="1080"/>
+      </w:pPr>
+      <w:rPr>
+        <w:rFonts w:eastAsia="Times New Roman" w:cs="Times New Roman" w:hint="default"/>
+        <w:b/>
+        <w:color w:val="0000FF"/>
+        <w:sz w:val="20"/>
+        <w:u w:val="single"/>
+      </w:rPr>
+    </w:lvl>
+    <w:lvl w:ilvl="3">
+      <w:start w:val="1"/>
+      <w:numFmt w:val="decimal"/>
+      <w:lvlText w:val="%1.%2.%3.%4"/>
+      <w:lvlJc w:val="left"/>
+      <w:pPr>
+        <w:ind w:left="3600" w:hanging="1440"/>
+      </w:pPr>
+      <w:rPr>
+        <w:rFonts w:eastAsia="Times New Roman" w:cs="Times New Roman" w:hint="default"/>
+        <w:b/>
+        <w:color w:val="0000FF"/>
+        <w:sz w:val="20"/>
+        <w:u w:val="single"/>
+      </w:rPr>
+    </w:lvl>
+    <w:lvl w:ilvl="4">
+      <w:start w:val="1"/>
+      <w:numFmt w:val="decimal"/>
+      <w:lvlText w:val="%1.%2.%3.%4.%5"/>
+      <w:lvlJc w:val="left"/>
+      <w:pPr>
+        <w:ind w:left="4320" w:hanging="1440"/>
+      </w:pPr>
+      <w:rPr>
+        <w:rFonts w:eastAsia="Times New Roman" w:cs="Times New Roman" w:hint="default"/>
+        <w:b/>
+        <w:color w:val="0000FF"/>
+        <w:sz w:val="20"/>
+        <w:u w:val="single"/>
+      </w:rPr>
+    </w:lvl>
+    <w:lvl w:ilvl="5">
+      <w:start w:val="1"/>
+      <w:numFmt w:val="decimal"/>
+      <w:lvlText w:val="%1.%2.%3.%4.%5.%6"/>
+      <w:lvlJc w:val="left"/>
+      <w:pPr>
+        <w:ind w:left="5400" w:hanging="1800"/>
+      </w:pPr>
+      <w:rPr>
+        <w:rFonts w:eastAsia="Times New Roman" w:cs="Times New Roman" w:hint="default"/>
+        <w:b/>
+        <w:color w:val="0000FF"/>
+        <w:sz w:val="20"/>
+        <w:u w:val="single"/>
+      </w:rPr>
+    </w:lvl>
+    <w:lvl w:ilvl="6">
+      <w:start w:val="1"/>
+      <w:numFmt w:val="decimal"/>
+      <w:lvlText w:val="%1.%2.%3.%4.%5.%6.%7"/>
+      <w:lvlJc w:val="left"/>
+      <w:pPr>
+        <w:ind w:left="6480" w:hanging="2160"/>
+      </w:pPr>
+      <w:rPr>
+        <w:rFonts w:eastAsia="Times New Roman" w:cs="Times New Roman" w:hint="default"/>
+        <w:b/>
+        <w:color w:val="0000FF"/>
+        <w:sz w:val="20"/>
+        <w:u w:val="single"/>
+      </w:rPr>
+    </w:lvl>
+    <w:lvl w:ilvl="7">
+      <w:start w:val="1"/>
+      <w:numFmt w:val="decimal"/>
+      <w:lvlText w:val="%1.%2.%3.%4.%5.%6.%7.%8"/>
+      <w:lvlJc w:val="left"/>
+      <w:pPr>
+        <w:ind w:left="7560" w:hanging="2520"/>
+      </w:pPr>
+      <w:rPr>
+        <w:rFonts w:eastAsia="Times New Roman" w:cs="Times New Roman" w:hint="default"/>
+        <w:b/>
+        <w:color w:val="0000FF"/>
+        <w:sz w:val="20"/>
+        <w:u w:val="single"/>
+      </w:rPr>
+    </w:lvl>
+    <w:lvl w:ilvl="8">
+      <w:start w:val="1"/>
+      <w:numFmt w:val="decimal"/>
+      <w:lvlText w:val="%1.%2.%3.%4.%5.%6.%7.%8.%9"/>
+      <w:lvlJc w:val="left"/>
+      <w:pPr>
+        <w:ind w:left="8640" w:hanging="2880"/>
+      </w:pPr>
+      <w:rPr>
+        <w:rFonts w:eastAsia="Times New Roman" w:cs="Times New Roman" w:hint="default"/>
+        <w:b/>
+        <w:color w:val="0000FF"/>
+        <w:sz w:val="20"/>
+        <w:u w:val="single"/>
+      </w:rPr>
+    </w:lvl>
+  </w:abstractNum>
+  <w:abstractNum w:abstractNumId="35" w15:restartNumberingAfterBreak="0">
     <w:nsid w:val="6ADD719A"/>
     <w:multiLevelType w:val="multilevel"/>
     <w:tmpl w:val="F5320D0E"/>
@@ -3956,7 +7785,7 @@
       </w:rPr>
     </w:lvl>
   </w:abstractNum>
-  <w:abstractNum w:abstractNumId="26" w15:restartNumberingAfterBreak="0">
+  <w:abstractNum w:abstractNumId="36" w15:restartNumberingAfterBreak="0">
     <w:nsid w:val="6B7123CE"/>
     <w:multiLevelType w:val="multilevel"/>
     <w:tmpl w:val="A26E0128"/>
@@ -4105,7 +7934,7 @@
       </w:rPr>
     </w:lvl>
   </w:abstractNum>
-  <w:abstractNum w:abstractNumId="27" w15:restartNumberingAfterBreak="0">
+  <w:abstractNum w:abstractNumId="37" w15:restartNumberingAfterBreak="0">
     <w:nsid w:val="716B66BC"/>
     <w:multiLevelType w:val="hybridMultilevel"/>
     <w:tmpl w:val="F22640B4"/>
@@ -4191,7 +8020,120 @@
       </w:pPr>
     </w:lvl>
   </w:abstractNum>
-  <w:abstractNum w:abstractNumId="28" w15:restartNumberingAfterBreak="0">
+  <w:abstractNum w:abstractNumId="38" w15:restartNumberingAfterBreak="0">
+    <w:nsid w:val="72575468"/>
+    <w:multiLevelType w:val="hybridMultilevel"/>
+    <w:tmpl w:val="E30E1D48"/>
+    <w:lvl w:ilvl="0" w:tplc="08090001">
+      <w:start w:val="1"/>
+      <w:numFmt w:val="bullet"/>
+      <w:lvlText w:val=""/>
+      <w:lvlJc w:val="left"/>
+      <w:pPr>
+        <w:ind w:left="360" w:hanging="360"/>
+      </w:pPr>
+      <w:rPr>
+        <w:rFonts w:ascii="Symbol" w:hAnsi="Symbol" w:hint="default"/>
+      </w:rPr>
+    </w:lvl>
+    <w:lvl w:ilvl="1" w:tplc="08090003" w:tentative="1">
+      <w:start w:val="1"/>
+      <w:numFmt w:val="bullet"/>
+      <w:lvlText w:val="o"/>
+      <w:lvlJc w:val="left"/>
+      <w:pPr>
+        <w:ind w:left="1080" w:hanging="360"/>
+      </w:pPr>
+      <w:rPr>
+        <w:rFonts w:ascii="Courier New" w:hAnsi="Courier New" w:hint="default"/>
+      </w:rPr>
+    </w:lvl>
+    <w:lvl w:ilvl="2" w:tplc="08090005" w:tentative="1">
+      <w:start w:val="1"/>
+      <w:numFmt w:val="bullet"/>
+      <w:lvlText w:val=""/>
+      <w:lvlJc w:val="left"/>
+      <w:pPr>
+        <w:ind w:left="1800" w:hanging="360"/>
+      </w:pPr>
+      <w:rPr>
+        <w:rFonts w:ascii="Wingdings" w:hAnsi="Wingdings" w:hint="default"/>
+      </w:rPr>
+    </w:lvl>
+    <w:lvl w:ilvl="3" w:tplc="08090001" w:tentative="1">
+      <w:start w:val="1"/>
+      <w:numFmt w:val="bullet"/>
+      <w:lvlText w:val=""/>
+      <w:lvlJc w:val="left"/>
+      <w:pPr>
+        <w:ind w:left="2520" w:hanging="360"/>
+      </w:pPr>
+      <w:rPr>
+        <w:rFonts w:ascii="Symbol" w:hAnsi="Symbol" w:hint="default"/>
+      </w:rPr>
+    </w:lvl>
+    <w:lvl w:ilvl="4" w:tplc="08090003" w:tentative="1">
+      <w:start w:val="1"/>
+      <w:numFmt w:val="bullet"/>
+      <w:lvlText w:val="o"/>
+      <w:lvlJc w:val="left"/>
+      <w:pPr>
+        <w:ind w:left="3240" w:hanging="360"/>
+      </w:pPr>
+      <w:rPr>
+        <w:rFonts w:ascii="Courier New" w:hAnsi="Courier New" w:hint="default"/>
+      </w:rPr>
+    </w:lvl>
+    <w:lvl w:ilvl="5" w:tplc="08090005" w:tentative="1">
+      <w:start w:val="1"/>
+      <w:numFmt w:val="bullet"/>
+      <w:lvlText w:val=""/>
+      <w:lvlJc w:val="left"/>
+      <w:pPr>
+        <w:ind w:left="3960" w:hanging="360"/>
+      </w:pPr>
+      <w:rPr>
+        <w:rFonts w:ascii="Wingdings" w:hAnsi="Wingdings" w:hint="default"/>
+      </w:rPr>
+    </w:lvl>
+    <w:lvl w:ilvl="6" w:tplc="08090001" w:tentative="1">
+      <w:start w:val="1"/>
+      <w:numFmt w:val="bullet"/>
+      <w:lvlText w:val=""/>
+      <w:lvlJc w:val="left"/>
+      <w:pPr>
+        <w:ind w:left="4680" w:hanging="360"/>
+      </w:pPr>
+      <w:rPr>
+        <w:rFonts w:ascii="Symbol" w:hAnsi="Symbol" w:hint="default"/>
+      </w:rPr>
+    </w:lvl>
+    <w:lvl w:ilvl="7" w:tplc="08090003" w:tentative="1">
+      <w:start w:val="1"/>
+      <w:numFmt w:val="bullet"/>
+      <w:lvlText w:val="o"/>
+      <w:lvlJc w:val="left"/>
+      <w:pPr>
+        <w:ind w:left="5400" w:hanging="360"/>
+      </w:pPr>
+      <w:rPr>
+        <w:rFonts w:ascii="Courier New" w:hAnsi="Courier New" w:hint="default"/>
+      </w:rPr>
+    </w:lvl>
+    <w:lvl w:ilvl="8" w:tplc="08090005" w:tentative="1">
+      <w:start w:val="1"/>
+      <w:numFmt w:val="bullet"/>
+      <w:lvlText w:val=""/>
+      <w:lvlJc w:val="left"/>
+      <w:pPr>
+        <w:ind w:left="6120" w:hanging="360"/>
+      </w:pPr>
+      <w:rPr>
+        <w:rFonts w:ascii="Wingdings" w:hAnsi="Wingdings" w:hint="default"/>
+      </w:rPr>
+    </w:lvl>
+  </w:abstractNum>
+  <w:abstractNum w:abstractNumId="39" w15:restartNumberingAfterBreak="0">
     <w:nsid w:val="733B6529"/>
     <w:multiLevelType w:val="multilevel"/>
     <w:tmpl w:val="2BD8448A"/>
@@ -4340,7 +8282,7 @@
       </w:rPr>
     </w:lvl>
   </w:abstractNum>
-  <w:abstractNum w:abstractNumId="29" w15:restartNumberingAfterBreak="0">
+  <w:abstractNum w:abstractNumId="40" w15:restartNumberingAfterBreak="0">
     <w:nsid w:val="75214468"/>
     <w:multiLevelType w:val="multilevel"/>
     <w:tmpl w:val="15E69B04"/>
@@ -4454,7 +8396,7 @@
       </w:pPr>
     </w:lvl>
   </w:abstractNum>
-  <w:abstractNum w:abstractNumId="30" w15:restartNumberingAfterBreak="0">
+  <w:abstractNum w:abstractNumId="41" w15:restartNumberingAfterBreak="0">
     <w:nsid w:val="7A1252F7"/>
     <w:multiLevelType w:val="hybridMultilevel"/>
     <w:tmpl w:val="30D61254"/>
@@ -4543,7 +8485,7 @@
       </w:pPr>
     </w:lvl>
   </w:abstractNum>
-  <w:abstractNum w:abstractNumId="31" w15:restartNumberingAfterBreak="0">
+  <w:abstractNum w:abstractNumId="42" w15:restartNumberingAfterBreak="0">
     <w:nsid w:val="7C564E1E"/>
     <w:multiLevelType w:val="multilevel"/>
     <w:tmpl w:val="5B342D58"/>
@@ -4693,100 +8635,163 @@
     </w:lvl>
   </w:abstractNum>
   <w:num w:numId="1" w16cid:durableId="663515528">
-    <w:abstractNumId w:val="29"/>
+    <w:abstractNumId w:val="40"/>
   </w:num>
   <w:num w:numId="2" w16cid:durableId="1312713859">
+    <w:abstractNumId w:val="36"/>
+  </w:num>
+  <w:num w:numId="3" w16cid:durableId="607543279">
+    <w:abstractNumId w:val="35"/>
+  </w:num>
+  <w:num w:numId="4" w16cid:durableId="2028679957">
+    <w:abstractNumId w:val="9"/>
+  </w:num>
+  <w:num w:numId="5" w16cid:durableId="860509185">
+    <w:abstractNumId w:val="10"/>
+  </w:num>
+  <w:num w:numId="6" w16cid:durableId="1859731957">
+    <w:abstractNumId w:val="23"/>
+  </w:num>
+  <w:num w:numId="7" w16cid:durableId="1084302976">
+    <w:abstractNumId w:val="21"/>
+  </w:num>
+  <w:num w:numId="8" w16cid:durableId="142966273">
+    <w:abstractNumId w:val="42"/>
+  </w:num>
+  <w:num w:numId="9" w16cid:durableId="1580599086">
+    <w:abstractNumId w:val="33"/>
+  </w:num>
+  <w:num w:numId="10" w16cid:durableId="1393772797">
     <w:abstractNumId w:val="26"/>
   </w:num>
-  <w:num w:numId="3" w16cid:durableId="607543279">
-    <w:abstractNumId w:val="25"/>
+  <w:num w:numId="11" w16cid:durableId="2010591876">
+    <w:abstractNumId w:val="17"/>
   </w:num>
-  <w:num w:numId="4" w16cid:durableId="2028679957">
+  <w:num w:numId="12" w16cid:durableId="1598824783">
+    <w:abstractNumId w:val="41"/>
+  </w:num>
+  <w:num w:numId="13" w16cid:durableId="2039119140">
+    <w:abstractNumId w:val="13"/>
+  </w:num>
+  <w:num w:numId="14" w16cid:durableId="171800040">
     <w:abstractNumId w:val="5"/>
   </w:num>
-  <w:num w:numId="5" w16cid:durableId="860509185">
-    <w:abstractNumId w:val="6"/>
-  </w:num>
-  <w:num w:numId="6" w16cid:durableId="1859731957">
-    <w:abstractNumId w:val="16"/>
-  </w:num>
-  <w:num w:numId="7" w16cid:durableId="1084302976">
-    <w:abstractNumId w:val="14"/>
-  </w:num>
-  <w:num w:numId="8" w16cid:durableId="142966273">
-    <w:abstractNumId w:val="31"/>
-  </w:num>
-  <w:num w:numId="9" w16cid:durableId="1580599086">
-    <w:abstractNumId w:val="24"/>
-  </w:num>
-  <w:num w:numId="10" w16cid:durableId="1393772797">
-    <w:abstractNumId w:val="17"/>
-  </w:num>
-  <w:num w:numId="11" w16cid:durableId="2010591876">
-    <w:abstractNumId w:val="11"/>
-  </w:num>
-  <w:num w:numId="12" w16cid:durableId="1598824783">
-    <w:abstractNumId w:val="30"/>
-  </w:num>
-  <w:num w:numId="13" w16cid:durableId="2039119140">
-    <w:abstractNumId w:val="8"/>
-  </w:num>
-  <w:num w:numId="14" w16cid:durableId="171800040">
-    <w:abstractNumId w:val="3"/>
-  </w:num>
   <w:num w:numId="15" w16cid:durableId="1573812194">
-    <w:abstractNumId w:val="27"/>
+    <w:abstractNumId w:val="37"/>
   </w:num>
   <w:num w:numId="16" w16cid:durableId="243223011">
-    <w:abstractNumId w:val="23"/>
+    <w:abstractNumId w:val="32"/>
   </w:num>
   <w:num w:numId="17" w16cid:durableId="713121826">
-    <w:abstractNumId w:val="19"/>
+    <w:abstractNumId w:val="28"/>
   </w:num>
   <w:num w:numId="18" w16cid:durableId="1915771413">
-    <w:abstractNumId w:val="18"/>
+    <w:abstractNumId w:val="27"/>
   </w:num>
   <w:num w:numId="19" w16cid:durableId="1674139550">
     <w:abstractNumId w:val="0"/>
   </w:num>
   <w:num w:numId="20" w16cid:durableId="168561905">
+    <w:abstractNumId w:val="3"/>
+  </w:num>
+  <w:num w:numId="21" w16cid:durableId="78216317">
+    <w:abstractNumId w:val="22"/>
+  </w:num>
+  <w:num w:numId="22" w16cid:durableId="2068530488">
+    <w:abstractNumId w:val="29"/>
+  </w:num>
+  <w:num w:numId="23" w16cid:durableId="761489948">
+    <w:abstractNumId w:val="8"/>
+  </w:num>
+  <w:num w:numId="24" w16cid:durableId="1572692034">
+    <w:abstractNumId w:val="39"/>
+  </w:num>
+  <w:num w:numId="25" w16cid:durableId="1172182841">
     <w:abstractNumId w:val="2"/>
   </w:num>
-  <w:num w:numId="21" w16cid:durableId="78216317">
+  <w:num w:numId="26" w16cid:durableId="2101681936">
+    <w:abstractNumId w:val="30"/>
+  </w:num>
+  <w:num w:numId="27" w16cid:durableId="388309425">
+    <w:abstractNumId w:val="18"/>
+  </w:num>
+  <w:num w:numId="28" w16cid:durableId="1002470248">
+    <w:abstractNumId w:val="11"/>
+  </w:num>
+  <w:num w:numId="29" w16cid:durableId="824127566">
+    <w:abstractNumId w:val="31"/>
+  </w:num>
+  <w:num w:numId="30" w16cid:durableId="819544933">
+    <w:abstractNumId w:val="16"/>
+  </w:num>
+  <w:num w:numId="31" w16cid:durableId="485976709">
+    <w:abstractNumId w:val="14"/>
+  </w:num>
+  <w:num w:numId="32" w16cid:durableId="1751534459">
+    <w:abstractNumId w:val="19"/>
+  </w:num>
+  <w:num w:numId="33" w16cid:durableId="967786318">
+    <w:abstractNumId w:val="20"/>
+  </w:num>
+  <w:num w:numId="34" w16cid:durableId="1209533462">
+    <w:abstractNumId w:val="25"/>
+  </w:num>
+  <w:num w:numId="35" w16cid:durableId="570164457">
+    <w:abstractNumId w:val="34"/>
+  </w:num>
+  <w:num w:numId="36" w16cid:durableId="1739474989">
+    <w:abstractNumId w:val="24"/>
+  </w:num>
+  <w:num w:numId="37" w16cid:durableId="358966890">
+    <w:abstractNumId w:val="12"/>
+  </w:num>
+  <w:num w:numId="38" w16cid:durableId="778910975">
     <w:abstractNumId w:val="15"/>
   </w:num>
-  <w:num w:numId="22" w16cid:durableId="2068530488">
-    <w:abstractNumId w:val="20"/>
+  <w:num w:numId="39" w16cid:durableId="1959755574">
+    <w:abstractNumId w:val="7"/>
   </w:num>
-  <w:num w:numId="23" w16cid:durableId="761489948">
+  <w:num w:numId="40" w16cid:durableId="2003701343">
+    <w:abstractNumId w:val="38"/>
+  </w:num>
+  <w:num w:numId="41" w16cid:durableId="1808934357">
+    <w:abstractNumId w:val="6"/>
+  </w:num>
+  <w:num w:numId="42" w16cid:durableId="321741326">
+    <w:abstractNumId w:val="1"/>
+  </w:num>
+  <w:num w:numId="43" w16cid:durableId="397292362">
     <w:abstractNumId w:val="4"/>
   </w:num>
-  <w:num w:numId="24" w16cid:durableId="1572692034">
-    <w:abstractNumId w:val="28"/>
-  </w:num>
-  <w:num w:numId="25" w16cid:durableId="1172182841">
-    <w:abstractNumId w:val="1"/>
-  </w:num>
-  <w:num w:numId="26" w16cid:durableId="2101681936">
-    <w:abstractNumId w:val="21"/>
-  </w:num>
-  <w:num w:numId="27" w16cid:durableId="388309425">
-    <w:abstractNumId w:val="12"/>
-  </w:num>
-  <w:num w:numId="28" w16cid:durableId="1002470248">
-    <w:abstractNumId w:val="7"/>
-  </w:num>
-  <w:num w:numId="29" w16cid:durableId="824127566">
-    <w:abstractNumId w:val="22"/>
-  </w:num>
-  <w:num w:numId="30" w16cid:durableId="819544933">
-    <w:abstractNumId w:val="10"/>
-  </w:num>
-  <w:num w:numId="31" w16cid:durableId="485976709">
-    <w:abstractNumId w:val="9"/>
-  </w:num>
-  <w:num w:numId="32" w16cid:durableId="1751534459">
-    <w:abstractNumId w:val="13"/>
+  <w:num w:numId="44" w16cid:durableId="686759784">
+    <w:abstractNumId w:val="4"/>
+    <w:lvlOverride w:ilvl="0">
+      <w:startOverride w:val="1"/>
+    </w:lvlOverride>
+    <w:lvlOverride w:ilvl="1">
+      <w:startOverride w:val="1"/>
+    </w:lvlOverride>
+    <w:lvlOverride w:ilvl="2">
+      <w:startOverride w:val="1"/>
+    </w:lvlOverride>
+    <w:lvlOverride w:ilvl="3">
+      <w:startOverride w:val="1"/>
+    </w:lvlOverride>
+    <w:lvlOverride w:ilvl="4">
+      <w:startOverride w:val="1"/>
+    </w:lvlOverride>
+    <w:lvlOverride w:ilvl="5">
+      <w:startOverride w:val="1"/>
+    </w:lvlOverride>
+    <w:lvlOverride w:ilvl="6">
+      <w:startOverride w:val="1"/>
+    </w:lvlOverride>
+    <w:lvlOverride w:ilvl="7">
+      <w:startOverride w:val="1"/>
+    </w:lvlOverride>
+    <w:lvlOverride w:ilvl="8">
+      <w:startOverride w:val="1"/>
+    </w:lvlOverride>
   </w:num>
   <w:numIdMacAtCleanup w:val="1"/>
 </w:numbering>
@@ -5206,11 +9211,15 @@
     <w:link w:val="Heading1Char"/>
     <w:uiPriority w:val="9"/>
     <w:qFormat/>
-    <w:rsid w:val="00BD42DC"/>
+    <w:rsid w:val="007E35CE"/>
     <w:pPr>
       <w:keepNext/>
       <w:keepLines/>
-      <w:spacing w:before="360" w:after="80"/>
+      <w:numPr>
+        <w:numId w:val="36"/>
+      </w:numPr>
+      <w:spacing w:before="480" w:after="120" w:line="240" w:lineRule="auto"/>
+      <w:ind w:left="601" w:hanging="601"/>
       <w:outlineLvl w:val="0"/>
     </w:pPr>
     <w:rPr>
@@ -5277,21 +9286,24 @@
   </w:style>
   <w:style w:type="paragraph" w:styleId="Heading5">
     <w:name w:val="heading 5"/>
-    <w:basedOn w:val="Heading1"/>
+    <w:basedOn w:val="ListParagraph"/>
     <w:next w:val="Normal"/>
     <w:link w:val="Heading5Char"/>
     <w:uiPriority w:val="9"/>
     <w:unhideWhenUsed/>
     <w:qFormat/>
-    <w:rsid w:val="00336650"/>
+    <w:rsid w:val="007208D4"/>
     <w:pPr>
-      <w:jc w:val="center"/>
+      <w:numPr>
+        <w:numId w:val="43"/>
+      </w:numPr>
+      <w:spacing w:before="120" w:after="160" w:line="240" w:lineRule="auto"/>
+      <w:contextualSpacing w:val="0"/>
       <w:outlineLvl w:val="4"/>
     </w:pPr>
     <w:rPr>
-      <w:color w:val="009193"/>
-      <w:sz w:val="32"/>
-      <w:szCs w:val="36"/>
+      <w:b/>
+      <w:bCs/>
     </w:rPr>
   </w:style>
   <w:style w:type="paragraph" w:styleId="Heading6">
@@ -5382,7 +9394,6 @@
   <w:style w:type="character" w:default="1" w:styleId="DefaultParagraphFont">
     <w:name w:val="Default Paragraph Font"/>
     <w:uiPriority w:val="1"/>
-    <w:semiHidden/>
     <w:unhideWhenUsed/>
   </w:style>
   <w:style w:type="table" w:default="1" w:styleId="TableNormal">
@@ -5443,7 +9454,7 @@
     <w:basedOn w:val="DefaultParagraphFont"/>
     <w:link w:val="Heading1"/>
     <w:uiPriority w:val="9"/>
-    <w:rsid w:val="00BD42DC"/>
+    <w:rsid w:val="007E35CE"/>
     <w:rPr>
       <w:rFonts w:ascii="Lato" w:eastAsiaTheme="majorEastAsia" w:hAnsi="Lato" w:cstheme="majorBidi"/>
       <w:color w:val="156082" w:themeColor="accent1"/>
@@ -5507,13 +9518,12 @@
     <w:basedOn w:val="DefaultParagraphFont"/>
     <w:link w:val="Heading5"/>
     <w:uiPriority w:val="9"/>
-    <w:rsid w:val="00336650"/>
+    <w:rsid w:val="007208D4"/>
     <w:rPr>
-      <w:rFonts w:ascii="Lato" w:eastAsiaTheme="majorEastAsia" w:hAnsi="Lato" w:cstheme="majorBidi"/>
-      <w:color w:val="009193"/>
+      <w:rFonts w:ascii="Lato" w:eastAsia="Times New Roman" w:hAnsi="Lato" w:cs="Times New Roman"/>
+      <w:b/>
+      <w:bCs/>
       <w:kern w:val="0"/>
-      <w:sz w:val="32"/>
-      <w:szCs w:val="36"/>
       <w:lang w:eastAsia="en-GB"/>
       <w14:ligatures w14:val="none"/>
     </w:rPr>
@@ -5886,7 +9896,7 @@
     <w:qFormat/>
     <w:rsid w:val="00C85DB6"/>
     <w:pPr>
-      <w:spacing w:before="480" w:after="0" w:line="276" w:lineRule="auto"/>
+      <w:spacing w:after="0" w:line="276" w:lineRule="auto"/>
       <w:outlineLvl w:val="9"/>
     </w:pPr>
     <w:rPr>
@@ -6149,6 +10159,22 @@
     <w:name w:val="annotation-92289d70-9312-450e-8326-00b24fd3e32e"/>
     <w:basedOn w:val="DefaultParagraphFont"/>
     <w:rsid w:val="008D6778"/>
+  </w:style>
+  <w:style w:type="table" w:styleId="TableGridLight">
+    <w:name w:val="Grid Table Light"/>
+    <w:basedOn w:val="TableNormal"/>
+    <w:uiPriority w:val="40"/>
+    <w:rsid w:val="00C63983"/>
+    <w:tblPr>
+      <w:tblBorders>
+        <w:top w:val="single" w:sz="4" w:space="0" w:color="BFBFBF" w:themeColor="background1" w:themeShade="BF"/>
+        <w:left w:val="single" w:sz="4" w:space="0" w:color="BFBFBF" w:themeColor="background1" w:themeShade="BF"/>
+        <w:bottom w:val="single" w:sz="4" w:space="0" w:color="BFBFBF" w:themeColor="background1" w:themeShade="BF"/>
+        <w:right w:val="single" w:sz="4" w:space="0" w:color="BFBFBF" w:themeColor="background1" w:themeShade="BF"/>
+        <w:insideH w:val="single" w:sz="4" w:space="0" w:color="BFBFBF" w:themeColor="background1" w:themeShade="BF"/>
+        <w:insideV w:val="single" w:sz="4" w:space="0" w:color="BFBFBF" w:themeColor="background1" w:themeShade="BF"/>
+      </w:tblBorders>
+    </w:tblPr>
   </w:style>
 </w:styles>
 </file>

</xml_diff>